<commit_message>
docs: improve presentation flow and synchronize speaker guide
</commit_message>
<xml_diff>
--- a/docs/LOI_THUYET_TRINH_VA_GIAI_THICH_KET_QUA.docx
+++ b/docs/LOI_THUYET_TRINH_VA_GIAI_THICH_KET_QUA.docx
@@ -41,53 +41,13 @@
       </w:r>
     </w:p>
     <w:p>
-      <w:pPr>
-        <w:pStyle w:val="u2"/>
-      </w:pPr>
-      <w:r>
-        <w:t>Cách sử dụng tài liệu</w:t>
+      <w:r>
+        <w:t>Phân công trình bày liên tục: Trịnh Ngọc Nga phụ trách slide 1–13; Nguyễn Tùng Dương phụ trách slide 14–22; Trương Việt Thành phụ trách slide 23–27 và demo. Mỗi người trình bày trọn phần rồi bàn giao một lần.</w:t>
       </w:r>
     </w:p>
     <w:p>
       <w:r>
-        <w:t xml:space="preserve">Lượt một, đọc phần </w:t>
-      </w:r>
-      <w:r>
-        <w:rPr>
-          <w:b/>
-        </w:rPr>
-        <w:t>Lời nói mẫu</w:t>
-      </w:r>
-      <w:r>
-        <w:t xml:space="preserve"> của 27 slide để nắm mạch trình bày. Lượt hai, học </w:t>
-      </w:r>
-      <w:r>
-        <w:rPr>
-          <w:b/>
-        </w:rPr>
-        <w:t>Cách đọc và giải thích</w:t>
-      </w:r>
-      <w:r>
-        <w:t xml:space="preserve"> ở các slide có thuật toán hoặc kết quả. Lượt ba, luyện trả lời câu hỏi và đọc các bảng bổ sung ở cuối tài liệu. Những đoạn in đậm là kiến thức nên ưu tiên nắm vững.</w:t>
-      </w:r>
-    </w:p>
-    <w:p>
-      <w:r>
-        <w:t xml:space="preserve">Phần lời nói dùng đại từ “nhóm em”; hãy đổi cách xưng hô cho phù hợp. Các ví dụ số nhỏ trong phần giảng giải là </w:t>
-      </w:r>
-      <w:r>
-        <w:rPr>
-          <w:b/>
-        </w:rPr>
-        <w:t>ví dụ minh họa do tài liệu này xây dựng</w:t>
-      </w:r>
-      <w:r>
-        <w:t>, không phải dữ liệu Test. Cơ chế thuật toán được giải thích theo source; khi chưa có thí nghiệm tách riêng nguyên nhân, tài liệu dùng “có thể”, “phù hợp với cơ chế” thay cho khẳng định nguyên nhân đã được chứng minh.</w:t>
-      </w:r>
-    </w:p>
-    <w:p>
-      <w:r>
-        <w:t>Không cần đọc nguyên văn mọi phần. Khi thuyết trình, ưu tiên vấn đề, nguyên lý, một kết quả tiêu biểu và giới hạn. Phần kiến thức sâu dùng để học và trả lời khi được hỏi. Thời lượng cần luyện thực tế; tài liệu không giả định một thời lượng giảng viên đã chốt.</w:t>
+        <w:t>Mạch thuyết trình: xác định câu hỏi → nhìn toàn bộ quy trình → hiểu thuật toán → hiểu tiêu chí đánh giá → đọc kết quả → xem ca cụ thể và ứng dụng. Các số trung bình toàn Test được giữ riêng với ví dụ một ảnh ở phần thuật toán.</w:t>
       </w:r>
     </w:p>
     <w:p>
@@ -95,6 +55,56 @@
         <w:pStyle w:val="u2"/>
       </w:pPr>
       <w:r>
+        <w:t>Cách sử dụng tài liệu</w:t>
+      </w:r>
+    </w:p>
+    <w:p>
+      <w:r>
+        <w:t xml:space="preserve">Lượt một, đọc phần </w:t>
+      </w:r>
+      <w:r>
+        <w:rPr>
+          <w:b/>
+        </w:rPr>
+        <w:t>Lời nói mẫu</w:t>
+      </w:r>
+      <w:r>
+        <w:t xml:space="preserve"> của 27 slide để nắm mạch trình bày. Lượt hai, học </w:t>
+      </w:r>
+      <w:r>
+        <w:rPr>
+          <w:b/>
+        </w:rPr>
+        <w:t>Cách đọc và giải thích</w:t>
+      </w:r>
+      <w:r>
+        <w:t xml:space="preserve"> ở các slide có thuật toán hoặc kết quả. Lượt ba, luyện trả lời câu hỏi và đọc các bảng bổ sung ở cuối tài liệu. Những đoạn in đậm là kiến thức nên ưu tiên nắm vững.</w:t>
+      </w:r>
+    </w:p>
+    <w:p>
+      <w:r>
+        <w:t xml:space="preserve">Phần lời nói dùng đại từ “nhóm em”; hãy đổi cách xưng hô cho phù hợp. Các ví dụ số nhỏ trong phần giảng giải là </w:t>
+      </w:r>
+      <w:r>
+        <w:rPr>
+          <w:b/>
+        </w:rPr>
+        <w:t>ví dụ minh họa do tài liệu này xây dựng</w:t>
+      </w:r>
+      <w:r>
+        <w:t>, không phải dữ liệu Test. Cơ chế thuật toán được giải thích theo source; khi chưa có thí nghiệm tách riêng nguyên nhân, tài liệu dùng “có thể”, “phù hợp với cơ chế” thay cho khẳng định nguyên nhân đã được chứng minh.</w:t>
+      </w:r>
+    </w:p>
+    <w:p>
+      <w:r>
+        <w:t>Không cần đọc nguyên văn mọi phần. Khi thuyết trình, ưu tiên vấn đề, nguyên lý, một kết quả tiêu biểu và giới hạn. Phần kiến thức sâu dùng để học và trả lời khi được hỏi. Thời lượng cần luyện thực tế; tài liệu không giả định một thời lượng giảng viên đã chốt.</w:t>
+      </w:r>
+    </w:p>
+    <w:p>
+      <w:pPr>
+        <w:pStyle w:val="u2"/>
+      </w:pPr>
+      <w:r>
         <w:t>Sáu nguyên tắc cần nhớ khi bảo vệ</w:t>
       </w:r>
     </w:p>
@@ -184,6 +194,7 @@
         <w:pStyle w:val="u2"/>
       </w:pPr>
       <w:r>
+        <w:lastRenderedPageBreak/>
         <w:t>Cách đọc số và ký hiệu</w:t>
       </w:r>
     </w:p>
@@ -203,7 +214,6 @@
     </w:p>
     <w:p>
       <w:r>
-        <w:lastRenderedPageBreak/>
         <w:t>Khoảng [0,1631; 0,2377] đọc “từ không phẩy một sáu ba một đến không phẩy hai ba bảy bảy”. 1,93 × 10⁻²⁰ đọc “một phẩy chín ba nhân mười mũ âm hai mươi”. Không đọc giá trị này là bằng không. Dấu gạch ở cột ΔE nghĩa là không tính hoặc không báo cáo cho trường hợp đó, không có nghĩa sai khác màu bằng không.</w:t>
       </w:r>
     </w:p>
@@ -283,7 +293,7 @@
       <w:r>
         <w:fldChar w:fldCharType="separate"/>
       </w:r>
-      <w:hyperlink w:anchor="_Toc243287434" w:history="1">
+      <w:hyperlink w:anchor="_Toc243605024" w:history="1">
         <w:r>
           <w:rPr>
             <w:rStyle w:val="Siuktni"/>
@@ -310,7 +320,7 @@
             <w:noProof/>
             <w:webHidden/>
           </w:rPr>
-          <w:instrText xml:space="preserve"> PAGEREF _Toc243287434 \h </w:instrText>
+          <w:instrText xml:space="preserve"> PAGEREF _Toc243605024 \h </w:instrText>
         </w:r>
         <w:r>
           <w:rPr>
@@ -358,13 +368,13 @@
           <w14:ligatures w14:val="standardContextual"/>
         </w:rPr>
       </w:pPr>
-      <w:hyperlink w:anchor="_Toc243287435" w:history="1">
+      <w:hyperlink w:anchor="_Toc243605025" w:history="1">
         <w:r>
           <w:rPr>
             <w:rStyle w:val="Siuktni"/>
             <w:noProof/>
           </w:rPr>
-          <w:t>Slide 02 Cấu trúc báo cáo</w:t>
+          <w:t>Slide 02 Mạch trình bày</w:t>
         </w:r>
         <w:r>
           <w:rPr>
@@ -385,7 +395,7 @@
             <w:noProof/>
             <w:webHidden/>
           </w:rPr>
-          <w:instrText xml:space="preserve"> PAGEREF _Toc243287435 \h </w:instrText>
+          <w:instrText xml:space="preserve"> PAGEREF _Toc243605025 \h </w:instrText>
         </w:r>
         <w:r>
           <w:rPr>
@@ -433,7 +443,7 @@
           <w14:ligatures w14:val="standardContextual"/>
         </w:rPr>
       </w:pPr>
-      <w:hyperlink w:anchor="_Toc243287436" w:history="1">
+      <w:hyperlink w:anchor="_Toc243605026" w:history="1">
         <w:r>
           <w:rPr>
             <w:rStyle w:val="Siuktni"/>
@@ -460,7 +470,7 @@
             <w:noProof/>
             <w:webHidden/>
           </w:rPr>
-          <w:instrText xml:space="preserve"> PAGEREF _Toc243287436 \h </w:instrText>
+          <w:instrText xml:space="preserve"> PAGEREF _Toc243605026 \h </w:instrText>
         </w:r>
         <w:r>
           <w:rPr>
@@ -508,13 +518,13 @@
           <w14:ligatures w14:val="standardContextual"/>
         </w:rPr>
       </w:pPr>
-      <w:hyperlink w:anchor="_Toc243287437" w:history="1">
+      <w:hyperlink w:anchor="_Toc243605027" w:history="1">
         <w:r>
           <w:rPr>
             <w:rStyle w:val="Siuktni"/>
             <w:noProof/>
           </w:rPr>
-          <w:t>Slide 04 Cơ chế xử lý và những đánh đổi</w:t>
+          <w:t>Slide 04 Quy trình xử lý và hai nhánh đánh giá</w:t>
         </w:r>
         <w:r>
           <w:rPr>
@@ -535,7 +545,7 @@
             <w:noProof/>
             <w:webHidden/>
           </w:rPr>
-          <w:instrText xml:space="preserve"> PAGEREF _Toc243287437 \h </w:instrText>
+          <w:instrText xml:space="preserve"> PAGEREF _Toc243605027 \h </w:instrText>
         </w:r>
         <w:r>
           <w:rPr>
@@ -583,7 +593,7 @@
           <w14:ligatures w14:val="standardContextual"/>
         </w:rPr>
       </w:pPr>
-      <w:hyperlink w:anchor="_Toc243287438" w:history="1">
+      <w:hyperlink w:anchor="_Toc243605028" w:history="1">
         <w:r>
           <w:rPr>
             <w:rStyle w:val="Siuktni"/>
@@ -610,7 +620,7 @@
             <w:noProof/>
             <w:webHidden/>
           </w:rPr>
-          <w:instrText xml:space="preserve"> PAGEREF _Toc243287438 \h </w:instrText>
+          <w:instrText xml:space="preserve"> PAGEREF _Toc243605028 \h </w:instrText>
         </w:r>
         <w:r>
           <w:rPr>
@@ -658,13 +668,13 @@
           <w14:ligatures w14:val="standardContextual"/>
         </w:rPr>
       </w:pPr>
-      <w:hyperlink w:anchor="_Toc243287439" w:history="1">
+      <w:hyperlink w:anchor="_Toc243605029" w:history="1">
         <w:r>
           <w:rPr>
             <w:rStyle w:val="Siuktni"/>
             <w:noProof/>
           </w:rPr>
-          <w:t>Slide 06 Tiền xử lý và không gian màu</w:t>
+          <w:t>Slide 06 Tiền xử lý thống nhất cho mọi ảnh</w:t>
         </w:r>
         <w:r>
           <w:rPr>
@@ -685,7 +695,7 @@
             <w:noProof/>
             <w:webHidden/>
           </w:rPr>
-          <w:instrText xml:space="preserve"> PAGEREF _Toc243287439 \h </w:instrText>
+          <w:instrText xml:space="preserve"> PAGEREF _Toc243605029 \h </w:instrText>
         </w:r>
         <w:r>
           <w:rPr>
@@ -733,7 +743,7 @@
           <w14:ligatures w14:val="standardContextual"/>
         </w:rPr>
       </w:pPr>
-      <w:hyperlink w:anchor="_Toc243287440" w:history="1">
+      <w:hyperlink w:anchor="_Toc243605030" w:history="1">
         <w:r>
           <w:rPr>
             <w:rStyle w:val="Siuktni"/>
@@ -760,7 +770,7 @@
             <w:noProof/>
             <w:webHidden/>
           </w:rPr>
-          <w:instrText xml:space="preserve"> PAGEREF _Toc243287440 \h </w:instrText>
+          <w:instrText xml:space="preserve"> PAGEREF _Toc243605030 \h </w:instrText>
         </w:r>
         <w:r>
           <w:rPr>
@@ -780,7 +790,7 @@
             <w:noProof/>
             <w:webHidden/>
           </w:rPr>
-          <w:t>6</w:t>
+          <w:t>7</w:t>
         </w:r>
         <w:r>
           <w:rPr>
@@ -808,7 +818,7 @@
           <w14:ligatures w14:val="standardContextual"/>
         </w:rPr>
       </w:pPr>
-      <w:hyperlink w:anchor="_Toc243287441" w:history="1">
+      <w:hyperlink w:anchor="_Toc243605031" w:history="1">
         <w:r>
           <w:rPr>
             <w:rStyle w:val="Siuktni"/>
@@ -835,7 +845,7 @@
             <w:noProof/>
             <w:webHidden/>
           </w:rPr>
-          <w:instrText xml:space="preserve"> PAGEREF _Toc243287441 \h </w:instrText>
+          <w:instrText xml:space="preserve"> PAGEREF _Toc243605031 \h </w:instrText>
         </w:r>
         <w:r>
           <w:rPr>
@@ -883,7 +893,7 @@
           <w14:ligatures w14:val="standardContextual"/>
         </w:rPr>
       </w:pPr>
-      <w:hyperlink w:anchor="_Toc243287442" w:history="1">
+      <w:hyperlink w:anchor="_Toc243605032" w:history="1">
         <w:r>
           <w:rPr>
             <w:rStyle w:val="Siuktni"/>
@@ -910,7 +920,7 @@
             <w:noProof/>
             <w:webHidden/>
           </w:rPr>
-          <w:instrText xml:space="preserve"> PAGEREF _Toc243287442 \h </w:instrText>
+          <w:instrText xml:space="preserve"> PAGEREF _Toc243605032 \h </w:instrText>
         </w:r>
         <w:r>
           <w:rPr>
@@ -958,7 +968,7 @@
           <w14:ligatures w14:val="standardContextual"/>
         </w:rPr>
       </w:pPr>
-      <w:hyperlink w:anchor="_Toc243287443" w:history="1">
+      <w:hyperlink w:anchor="_Toc243605033" w:history="1">
         <w:r>
           <w:rPr>
             <w:rStyle w:val="Siuktni"/>
@@ -985,7 +995,7 @@
             <w:noProof/>
             <w:webHidden/>
           </w:rPr>
-          <w:instrText xml:space="preserve"> PAGEREF _Toc243287443 \h </w:instrText>
+          <w:instrText xml:space="preserve"> PAGEREF _Toc243605033 \h </w:instrText>
         </w:r>
         <w:r>
           <w:rPr>
@@ -1033,7 +1043,7 @@
           <w14:ligatures w14:val="standardContextual"/>
         </w:rPr>
       </w:pPr>
-      <w:hyperlink w:anchor="_Toc243287444" w:history="1">
+      <w:hyperlink w:anchor="_Toc243605034" w:history="1">
         <w:r>
           <w:rPr>
             <w:rStyle w:val="Siuktni"/>
@@ -1060,7 +1070,7 @@
             <w:noProof/>
             <w:webHidden/>
           </w:rPr>
-          <w:instrText xml:space="preserve"> PAGEREF _Toc243287444 \h </w:instrText>
+          <w:instrText xml:space="preserve"> PAGEREF _Toc243605034 \h </w:instrText>
         </w:r>
         <w:r>
           <w:rPr>
@@ -1108,7 +1118,7 @@
           <w14:ligatures w14:val="standardContextual"/>
         </w:rPr>
       </w:pPr>
-      <w:hyperlink w:anchor="_Toc243287445" w:history="1">
+      <w:hyperlink w:anchor="_Toc243605035" w:history="1">
         <w:r>
           <w:rPr>
             <w:rStyle w:val="Siuktni"/>
@@ -1135,7 +1145,7 @@
             <w:noProof/>
             <w:webHidden/>
           </w:rPr>
-          <w:instrText xml:space="preserve"> PAGEREF _Toc243287445 \h </w:instrText>
+          <w:instrText xml:space="preserve"> PAGEREF _Toc243605035 \h </w:instrText>
         </w:r>
         <w:r>
           <w:rPr>
@@ -1183,13 +1193,13 @@
           <w14:ligatures w14:val="standardContextual"/>
         </w:rPr>
       </w:pPr>
-      <w:hyperlink w:anchor="_Toc243287446" w:history="1">
+      <w:hyperlink w:anchor="_Toc243605036" w:history="1">
         <w:r>
           <w:rPr>
             <w:rStyle w:val="Siuktni"/>
             <w:noProof/>
           </w:rPr>
-          <w:t>Slide 13 Đọc đồng thời nhiễu biên chi tiết và màu</w:t>
+          <w:t>Slide 13 Chất lượng ảnh và nhận diện được đo riêng</w:t>
         </w:r>
         <w:r>
           <w:rPr>
@@ -1210,7 +1220,7 @@
             <w:noProof/>
             <w:webHidden/>
           </w:rPr>
-          <w:instrText xml:space="preserve"> PAGEREF _Toc243287446 \h </w:instrText>
+          <w:instrText xml:space="preserve"> PAGEREF _Toc243605036 \h </w:instrText>
         </w:r>
         <w:r>
           <w:rPr>
@@ -1258,13 +1268,13 @@
           <w14:ligatures w14:val="standardContextual"/>
         </w:rPr>
       </w:pPr>
-      <w:hyperlink w:anchor="_Toc243287447" w:history="1">
+      <w:hyperlink w:anchor="_Toc243605037" w:history="1">
         <w:r>
           <w:rPr>
             <w:rStyle w:val="Siuktni"/>
             <w:noProof/>
           </w:rPr>
-          <w:t>Slide 14 Thiết kế 49 điều kiện</w:t>
+          <w:t>Slide 14 49 điều kiện với tham số khóa trên Validation</w:t>
         </w:r>
         <w:r>
           <w:rPr>
@@ -1285,7 +1295,7 @@
             <w:noProof/>
             <w:webHidden/>
           </w:rPr>
-          <w:instrText xml:space="preserve"> PAGEREF _Toc243287447 \h </w:instrText>
+          <w:instrText xml:space="preserve"> PAGEREF _Toc243605037 \h </w:instrText>
         </w:r>
         <w:r>
           <w:rPr>
@@ -1333,7 +1343,7 @@
           <w14:ligatures w14:val="standardContextual"/>
         </w:rPr>
       </w:pPr>
-      <w:hyperlink w:anchor="_Toc243287448" w:history="1">
+      <w:hyperlink w:anchor="_Toc243605038" w:history="1">
         <w:r>
           <w:rPr>
             <w:rStyle w:val="Siuktni"/>
@@ -1360,7 +1370,7 @@
             <w:noProof/>
             <w:webHidden/>
           </w:rPr>
-          <w:instrText xml:space="preserve"> PAGEREF _Toc243287448 \h </w:instrText>
+          <w:instrText xml:space="preserve"> PAGEREF _Toc243605038 \h </w:instrText>
         </w:r>
         <w:r>
           <w:rPr>
@@ -1408,7 +1418,7 @@
           <w14:ligatures w14:val="standardContextual"/>
         </w:rPr>
       </w:pPr>
-      <w:hyperlink w:anchor="_Toc243287449" w:history="1">
+      <w:hyperlink w:anchor="_Toc243605039" w:history="1">
         <w:r>
           <w:rPr>
             <w:rStyle w:val="Siuktni"/>
@@ -1435,7 +1445,7 @@
             <w:noProof/>
             <w:webHidden/>
           </w:rPr>
-          <w:instrText xml:space="preserve"> PAGEREF _Toc243287449 \h </w:instrText>
+          <w:instrText xml:space="preserve"> PAGEREF _Toc243605039 \h </w:instrText>
         </w:r>
         <w:r>
           <w:rPr>
@@ -1483,7 +1493,7 @@
           <w14:ligatures w14:val="standardContextual"/>
         </w:rPr>
       </w:pPr>
-      <w:hyperlink w:anchor="_Toc243287450" w:history="1">
+      <w:hyperlink w:anchor="_Toc243605040" w:history="1">
         <w:r>
           <w:rPr>
             <w:rStyle w:val="Siuktni"/>
@@ -1510,7 +1520,7 @@
             <w:noProof/>
             <w:webHidden/>
           </w:rPr>
-          <w:instrText xml:space="preserve"> PAGEREF _Toc243287450 \h </w:instrText>
+          <w:instrText xml:space="preserve"> PAGEREF _Toc243605040 \h </w:instrText>
         </w:r>
         <w:r>
           <w:rPr>
@@ -1558,7 +1568,7 @@
           <w14:ligatures w14:val="standardContextual"/>
         </w:rPr>
       </w:pPr>
-      <w:hyperlink w:anchor="_Toc243287451" w:history="1">
+      <w:hyperlink w:anchor="_Toc243605041" w:history="1">
         <w:r>
           <w:rPr>
             <w:rStyle w:val="Siuktni"/>
@@ -1585,7 +1595,7 @@
             <w:noProof/>
             <w:webHidden/>
           </w:rPr>
-          <w:instrText xml:space="preserve"> PAGEREF _Toc243287451 \h </w:instrText>
+          <w:instrText xml:space="preserve"> PAGEREF _Toc243605041 \h </w:instrText>
         </w:r>
         <w:r>
           <w:rPr>
@@ -1633,7 +1643,7 @@
           <w14:ligatures w14:val="standardContextual"/>
         </w:rPr>
       </w:pPr>
-      <w:hyperlink w:anchor="_Toc243287452" w:history="1">
+      <w:hyperlink w:anchor="_Toc243605042" w:history="1">
         <w:r>
           <w:rPr>
             <w:rStyle w:val="Siuktni"/>
@@ -1660,7 +1670,7 @@
             <w:noProof/>
             <w:webHidden/>
           </w:rPr>
-          <w:instrText xml:space="preserve"> PAGEREF _Toc243287452 \h </w:instrText>
+          <w:instrText xml:space="preserve"> PAGEREF _Toc243605042 \h </w:instrText>
         </w:r>
         <w:r>
           <w:rPr>
@@ -1708,7 +1718,7 @@
           <w14:ligatures w14:val="standardContextual"/>
         </w:rPr>
       </w:pPr>
-      <w:hyperlink w:anchor="_Toc243287453" w:history="1">
+      <w:hyperlink w:anchor="_Toc243605043" w:history="1">
         <w:r>
           <w:rPr>
             <w:rStyle w:val="Siuktni"/>
@@ -1735,7 +1745,7 @@
             <w:noProof/>
             <w:webHidden/>
           </w:rPr>
-          <w:instrText xml:space="preserve"> PAGEREF _Toc243287453 \h </w:instrText>
+          <w:instrText xml:space="preserve"> PAGEREF _Toc243605043 \h </w:instrText>
         </w:r>
         <w:r>
           <w:rPr>
@@ -1783,7 +1793,7 @@
           <w14:ligatures w14:val="standardContextual"/>
         </w:rPr>
       </w:pPr>
-      <w:hyperlink w:anchor="_Toc243287454" w:history="1">
+      <w:hyperlink w:anchor="_Toc243605044" w:history="1">
         <w:r>
           <w:rPr>
             <w:rStyle w:val="Siuktni"/>
@@ -1810,7 +1820,7 @@
             <w:noProof/>
             <w:webHidden/>
           </w:rPr>
-          <w:instrText xml:space="preserve"> PAGEREF _Toc243287454 \h </w:instrText>
+          <w:instrText xml:space="preserve"> PAGEREF _Toc243605044 \h </w:instrText>
         </w:r>
         <w:r>
           <w:rPr>
@@ -1858,7 +1868,7 @@
           <w14:ligatures w14:val="standardContextual"/>
         </w:rPr>
       </w:pPr>
-      <w:hyperlink w:anchor="_Toc243287455" w:history="1">
+      <w:hyperlink w:anchor="_Toc243605045" w:history="1">
         <w:r>
           <w:rPr>
             <w:rStyle w:val="Siuktni"/>
@@ -1885,7 +1895,7 @@
             <w:noProof/>
             <w:webHidden/>
           </w:rPr>
-          <w:instrText xml:space="preserve"> PAGEREF _Toc243287455 \h </w:instrText>
+          <w:instrText xml:space="preserve"> PAGEREF _Toc243605045 \h </w:instrText>
         </w:r>
         <w:r>
           <w:rPr>
@@ -1933,7 +1943,7 @@
           <w14:ligatures w14:val="standardContextual"/>
         </w:rPr>
       </w:pPr>
-      <w:hyperlink w:anchor="_Toc243287456" w:history="1">
+      <w:hyperlink w:anchor="_Toc243605046" w:history="1">
         <w:r>
           <w:rPr>
             <w:rStyle w:val="Siuktni"/>
@@ -1960,7 +1970,7 @@
             <w:noProof/>
             <w:webHidden/>
           </w:rPr>
-          <w:instrText xml:space="preserve"> PAGEREF _Toc243287456 \h </w:instrText>
+          <w:instrText xml:space="preserve"> PAGEREF _Toc243605046 \h </w:instrText>
         </w:r>
         <w:r>
           <w:rPr>
@@ -2008,7 +2018,7 @@
           <w14:ligatures w14:val="standardContextual"/>
         </w:rPr>
       </w:pPr>
-      <w:hyperlink w:anchor="_Toc243287457" w:history="1">
+      <w:hyperlink w:anchor="_Toc243605047" w:history="1">
         <w:r>
           <w:rPr>
             <w:rStyle w:val="Siuktni"/>
@@ -2035,7 +2045,7 @@
             <w:noProof/>
             <w:webHidden/>
           </w:rPr>
-          <w:instrText xml:space="preserve"> PAGEREF _Toc243287457 \h </w:instrText>
+          <w:instrText xml:space="preserve"> PAGEREF _Toc243605047 \h </w:instrText>
         </w:r>
         <w:r>
           <w:rPr>
@@ -2083,7 +2093,7 @@
           <w14:ligatures w14:val="standardContextual"/>
         </w:rPr>
       </w:pPr>
-      <w:hyperlink w:anchor="_Toc243287458" w:history="1">
+      <w:hyperlink w:anchor="_Toc243605048" w:history="1">
         <w:r>
           <w:rPr>
             <w:rStyle w:val="Siuktni"/>
@@ -2110,7 +2120,7 @@
             <w:noProof/>
             <w:webHidden/>
           </w:rPr>
-          <w:instrText xml:space="preserve"> PAGEREF _Toc243287458 \h </w:instrText>
+          <w:instrText xml:space="preserve"> PAGEREF _Toc243605048 \h </w:instrText>
         </w:r>
         <w:r>
           <w:rPr>
@@ -2158,7 +2168,7 @@
           <w14:ligatures w14:val="standardContextual"/>
         </w:rPr>
       </w:pPr>
-      <w:hyperlink w:anchor="_Toc243287459" w:history="1">
+      <w:hyperlink w:anchor="_Toc243605049" w:history="1">
         <w:r>
           <w:rPr>
             <w:rStyle w:val="Siuktni"/>
@@ -2185,7 +2195,7 @@
             <w:noProof/>
             <w:webHidden/>
           </w:rPr>
-          <w:instrText xml:space="preserve"> PAGEREF _Toc243287459 \h </w:instrText>
+          <w:instrText xml:space="preserve"> PAGEREF _Toc243605049 \h </w:instrText>
         </w:r>
         <w:r>
           <w:rPr>
@@ -2233,7 +2243,7 @@
           <w14:ligatures w14:val="standardContextual"/>
         </w:rPr>
       </w:pPr>
-      <w:hyperlink w:anchor="_Toc243287460" w:history="1">
+      <w:hyperlink w:anchor="_Toc243605050" w:history="1">
         <w:r>
           <w:rPr>
             <w:rStyle w:val="Siuktni"/>
@@ -2260,7 +2270,7 @@
             <w:noProof/>
             <w:webHidden/>
           </w:rPr>
-          <w:instrText xml:space="preserve"> PAGEREF _Toc243287460 \h </w:instrText>
+          <w:instrText xml:space="preserve"> PAGEREF _Toc243605050 \h </w:instrText>
         </w:r>
         <w:r>
           <w:rPr>
@@ -2308,7 +2318,7 @@
           <w14:ligatures w14:val="standardContextual"/>
         </w:rPr>
       </w:pPr>
-      <w:hyperlink w:anchor="_Toc243287461" w:history="1">
+      <w:hyperlink w:anchor="_Toc243605051" w:history="1">
         <w:r>
           <w:rPr>
             <w:rStyle w:val="Siuktni"/>
@@ -2335,7 +2345,7 @@
             <w:noProof/>
             <w:webHidden/>
           </w:rPr>
-          <w:instrText xml:space="preserve"> PAGEREF _Toc243287461 \h </w:instrText>
+          <w:instrText xml:space="preserve"> PAGEREF _Toc243605051 \h </w:instrText>
         </w:r>
         <w:r>
           <w:rPr>
@@ -2383,7 +2393,7 @@
           <w14:ligatures w14:val="standardContextual"/>
         </w:rPr>
       </w:pPr>
-      <w:hyperlink w:anchor="_Toc243287462" w:history="1">
+      <w:hyperlink w:anchor="_Toc243605052" w:history="1">
         <w:r>
           <w:rPr>
             <w:rStyle w:val="Siuktni"/>
@@ -2410,7 +2420,7 @@
             <w:noProof/>
             <w:webHidden/>
           </w:rPr>
-          <w:instrText xml:space="preserve"> PAGEREF _Toc243287462 \h </w:instrText>
+          <w:instrText xml:space="preserve"> PAGEREF _Toc243605052 \h </w:instrText>
         </w:r>
         <w:r>
           <w:rPr>
@@ -2458,7 +2468,7 @@
           <w14:ligatures w14:val="standardContextual"/>
         </w:rPr>
       </w:pPr>
-      <w:hyperlink w:anchor="_Toc243287463" w:history="1">
+      <w:hyperlink w:anchor="_Toc243605053" w:history="1">
         <w:r>
           <w:rPr>
             <w:rStyle w:val="Siuktni"/>
@@ -2485,7 +2495,7 @@
             <w:noProof/>
             <w:webHidden/>
           </w:rPr>
-          <w:instrText xml:space="preserve"> PAGEREF _Toc243287463 \h </w:instrText>
+          <w:instrText xml:space="preserve"> PAGEREF _Toc243605053 \h </w:instrText>
         </w:r>
         <w:r>
           <w:rPr>
@@ -2533,7 +2543,7 @@
           <w14:ligatures w14:val="standardContextual"/>
         </w:rPr>
       </w:pPr>
-      <w:hyperlink w:anchor="_Toc243287464" w:history="1">
+      <w:hyperlink w:anchor="_Toc243605054" w:history="1">
         <w:r>
           <w:rPr>
             <w:rStyle w:val="Siuktni"/>
@@ -2560,7 +2570,7 @@
             <w:noProof/>
             <w:webHidden/>
           </w:rPr>
-          <w:instrText xml:space="preserve"> PAGEREF _Toc243287464 \h </w:instrText>
+          <w:instrText xml:space="preserve"> PAGEREF _Toc243605054 \h </w:instrText>
         </w:r>
         <w:r>
           <w:rPr>
@@ -2601,7 +2611,7 @@
         <w:pStyle w:val="u1"/>
         <w:pageBreakBefore/>
       </w:pPr>
-      <w:bookmarkStart w:id="0" w:name="_Toc243287434"/>
+      <w:bookmarkStart w:id="0" w:name="_Toc243605024"/>
       <w:r>
         <w:lastRenderedPageBreak/>
         <w:t>Slide 01 Giới thiệu đề tài</w:t>
@@ -2618,7 +2628,7 @@
     </w:p>
     <w:p>
       <w:r>
-        <w:t>“Kính chào thầy cô. Nhóm em trình bày đề tài tăng cường và phục hồi ảnh hoa trong điều kiện suy giảm. Bài tập tập trung vào các kỹ thuật xử lý ảnh cổ điển như hiệu chỉnh sáng, khử nhiễu, làm sắc nét và hiệu chỉnh màu. Nhóm đo đồng thời chất lượng ảnh so với ảnh sạch và tác động đến nhận diện bằng cùng một MobileNetV2 đã huấn luyện. Thực nghiệm gồm năm dạng suy giảm, ba mức cho mỗi dạng và tổng cộng 49 điều kiện trên 550 ảnh Test. Điểm nhóm muốn làm rõ là: một ảnh nhìn tốt hơn hoặc có SSIM cao hơn chưa chắc đã giúp mô hình nhận diện tốt hơn.”</w:t>
+        <w:t>“Kính chào thầy cô. Nhóm em khảo sát các kỹ thuật tăng cường và phục hồi ảnh hoa khi thiếu sáng, nhiễu, mờ hoặc lệch màu. Nhóm so ảnh sau xử lý với ảnh sạch, đồng thời kiểm tra nhận diện bằng một MobileNetV2 cố định. Câu hỏi xuyên suốt là: xử lý làm ảnh tốt hơn đến đâu và có giúp nhận diện tốt hơn không?”</w:t>
       </w:r>
     </w:p>
     <w:p>
@@ -2655,6 +2665,14 @@
       </w:r>
     </w:p>
     <w:p>
+      <w:r>
+        <w:rPr>
+          <w:i/>
+        </w:rPr>
+        <w:t>Người trình bày: Trịnh Ngọc Nga. Chuyển ý: “Em xin giới thiệu năm phần chính của bài trình bày.”</w:t>
+      </w:r>
+    </w:p>
+    <w:p>
       <w:pPr>
         <w:spacing w:before="60"/>
       </w:pPr>
@@ -2670,9 +2688,9 @@
       <w:pPr>
         <w:pStyle w:val="u1"/>
       </w:pPr>
-      <w:bookmarkStart w:id="1" w:name="_Toc243287435"/>
-      <w:r>
-        <w:t>Slide 02 Cấu trúc báo cáo</w:t>
+      <w:bookmarkStart w:id="1" w:name="_Toc243605025"/>
+      <w:r>
+        <w:t>Slide 02 Mạch trình bày</w:t>
       </w:r>
       <w:bookmarkEnd w:id="1"/>
     </w:p>
@@ -2686,7 +2704,7 @@
     </w:p>
     <w:p>
       <w:r>
-        <w:t>“Báo cáo có 12 chương, nhưng khi thuyết trình em chia thành bốn cụm. Thứ nhất là bài toán, cơ sở và dữ liệu. Thứ hai là các kỹ thuật xử lý ảnh cùng thiết kế thực nghiệm. Thứ ba là kết quả, thảo luận và các ca thành công hoặc thất bại. Cuối cùng là ứng dụng minh họa, kết luận và giới hạn. Em sẽ dành phần lớn thời gian cho nguyên lý xử lý ảnh và cách giải thích kết quả.”</w:t>
+        <w:t>“Bài trình bày đi qua năm phần. Trước hết là bài toán và dữ liệu; tiếp theo là nguyên lý các kỹ thuật xử lý ảnh. Sau đó nhóm giải thích cách thiết kế và đánh giá thực nghiệm, đọc kết quả tổng hợp cùng các ca cụ thể, rồi minh họa ứng dụng và kết luận. Các phần này được rút từ báo cáo 12 chương để người nghe theo dõi một quy trình liên tục.”</w:t>
       </w:r>
     </w:p>
     <w:p>
@@ -2694,12 +2712,12 @@
         <w:pStyle w:val="u2"/>
       </w:pPr>
       <w:r>
-        <w:t>Cách trình bày</w:t>
+        <w:t>Cách trình bày năm phần</w:t>
       </w:r>
     </w:p>
     <w:p>
       <w:r>
-        <w:t>Không đọc lần lượt toàn bộ 12 tên chương. Chỉ tay theo nhóm nội dung và cho người nghe biết trọng tâm nằm ở phương pháp và kết quả. Slide này là bản đồ để theo dõi, không phải nội dung cần phân tích dài.</w:t>
+        <w:t>Chỉ theo thứ tự năm phần trên slide: bài toán và dữ liệu, kỹ thuật xử lý ảnh, thiết kế đánh giá, kết quả và ca minh họa, ứng dụng và kết luận. Nhấn rằng người nghe sẽ thấy cách làm trước, sau đó mới đọc bằng chứng và giới hạn.</w:t>
       </w:r>
     </w:p>
     <w:p>
@@ -2707,10 +2725,15 @@
         <w:rPr>
           <w:b/>
         </w:rPr>
-        <w:t>Tránh nhầm:</w:t>
-      </w:r>
-      <w:r>
-        <w:t xml:space="preserve"> 12 chương trong báo cáo không đồng nghĩa chỉ có 12 slide; bộ hiện tại có 27 slide. Chuyển ý: “Trước tiên, nhóm xác định mình muốn đo điều gì khi ảnh bị suy giảm.”</w:t>
+        <w:t>Báo cáo viết giữ cấu trúc 12 chương; slide dùng năm cụm để trình bày miệng. Không đọc lại toàn bộ mục lục báo cáo khi trên màn hình đã là mạch năm phần.</w:t>
+      </w:r>
+    </w:p>
+    <w:p>
+      <w:r>
+        <w:rPr>
+          <w:i/>
+        </w:rPr>
+        <w:t>Người trình bày: Trịnh Ngọc Nga. Chuyển ý: “Trước tiên, nhóm xác định các câu hỏi cần trả lời và phạm vi kết luận.”</w:t>
       </w:r>
     </w:p>
     <w:p>
@@ -2729,7 +2752,7 @@
       <w:pPr>
         <w:pStyle w:val="u1"/>
       </w:pPr>
-      <w:bookmarkStart w:id="2" w:name="_Toc243287436"/>
+      <w:bookmarkStart w:id="2" w:name="_Toc243605026"/>
       <w:r>
         <w:t>Slide 03 Câu hỏi và phạm vi đánh giá</w:t>
       </w:r>
@@ -2745,7 +2768,7 @@
     </w:p>
     <w:p>
       <w:r>
-        <w:t>“Nhóm đặt ba câu hỏi chính. Một là suy giảm làm thay đổi pixel, cấu trúc và màu thế nào. Hai là kỹ thuật nào giảm nhiễu nhưng vẫn giữ được biên, chi tiết và dấu hiệu của hoa. Ba là thay đổi chất lượng ảnh có đi cùng thay đổi nhận diện hay không. Để so sánh có ý nghĩa, nhóm giữ nguyên tập Test, cách tiền xử lý và checkpoint. Phạm vi hiện tại là năm lớp hoa và các suy giảm tổng hợp có loại, mức đã biết. Vì vậy kết quả cho thấy hành vi trong thí nghiệm này, chưa đại diện cho mọi ảnh thực.”</w:t>
+        <w:t>“Nhóm đặt ba câu hỏi: suy giảm làm thay đổi ảnh như thế nào; từng kỹ thuật phục hồi được gì và đánh đổi gì; chất lượng ảnh tăng có đi cùng nhận diện tăng hay không. Thí nghiệm dùng năm lớp hoa, suy giảm tổng hợp biết trước loại và mức, cùng một split và checkpoint. Vì vậy kết luận được giới hạn trong các cấu hình đã khảo sát.”</w:t>
       </w:r>
     </w:p>
     <w:p>
@@ -2753,6 +2776,7 @@
         <w:pStyle w:val="u2"/>
       </w:pPr>
       <w:r>
+        <w:lastRenderedPageBreak/>
         <w:t>Cách giải thích thiết kế</w:t>
       </w:r>
     </w:p>
@@ -2782,11 +2806,7 @@
         <w:t>Kết quả quan sát:</w:t>
       </w:r>
       <w:r>
-        <w:t xml:space="preserve"> metric ảnh, metric phân </w:t>
-      </w:r>
-      <w:r>
-        <w:lastRenderedPageBreak/>
-        <w:t>loại và thời gian trong phạm vi đo đã định nghĩa. Cách làm này giảm khả năng nhầm hiệu quả của xử lý ảnh với hiệu quả của thay mô hình.</w:t>
+        <w:t xml:space="preserve"> metric ảnh, metric phân loại và thời gian trong phạm vi đo đã định nghĩa. Cách làm này giảm khả năng nhầm hiệu quả của xử lý ảnh với hiệu quả của thay mô hình.</w:t>
       </w:r>
     </w:p>
     <w:p>
@@ -2798,6 +2818,14 @@
       </w:r>
       <w:r>
         <w:t xml:space="preserve"> “Đó là một hướng đối chứng khác. Ở bài này, nhóm giữ classifier cố định để quan sát tác động của thay đổi đầu vào; nếu đồng thời đổi model thì khó tách hai tác động.”</w:t>
+      </w:r>
+    </w:p>
+    <w:p>
+      <w:r>
+        <w:rPr>
+          <w:i/>
+        </w:rPr>
+        <w:t>Người trình bày: Trịnh Ngọc Nga. Chuyển ý: “Để trả lời nhất quán, toàn bộ thí nghiệm đi theo quy trình sau.”</w:t>
       </w:r>
     </w:p>
     <w:p>
@@ -2816,9 +2844,9 @@
       <w:pPr>
         <w:pStyle w:val="u1"/>
       </w:pPr>
-      <w:bookmarkStart w:id="3" w:name="_Toc243287437"/>
-      <w:r>
-        <w:t>Slide 04 Cơ chế xử lý và những đánh đổi</w:t>
+      <w:bookmarkStart w:id="3" w:name="_Toc243605027"/>
+      <w:r>
+        <w:t>Slide 04 Quy trình xử lý và hai nhánh đánh giá</w:t>
       </w:r>
       <w:bookmarkEnd w:id="3"/>
     </w:p>
@@ -2832,7 +2860,7 @@
     </w:p>
     <w:p>
       <w:r>
-        <w:t>“Các kỹ thuật được chia theo thao tác lên ảnh. Ánh xạ cường độ như Gamma thay độ sáng của pixel; CLAHE tăng tương phản cục bộ. Lọc lân cận như Gaussian, median hoặc bilateral dùng thông tin vùng quanh pixel để giảm nhiễu. Làm sắc nét tăng thành phần chi tiết còn lại, còn hiệu chỉnh màu thay phân bố các kênh. Mỗi thao tác đều có đánh đổi: lọc mạnh có thể xóa texture; tăng sắc nét có thể tăng nhiễu hoặc halo; đưa màu về trung tính có thể làm mất màu đặc trưng của bông hoa.”</w:t>
+        <w:t>“Ảnh gốc được tiền xử lý rồi tạo suy giảm. Mỗi phương pháp nhận cùng ảnh suy giảm và tạo một ảnh sau xử lý riêng, không xếp chồng tất cả phương pháp. Nhánh chất lượng so ảnh đó với ảnh sạch bằng PSNR, SSIM và sai khác màu. Nhánh nhận diện đưa các trạng thái vào cùng MobileNetV2 để so nhãn và Macro F1. Ảnh sạch là tham chiếu để chấm điểm, không phải đầu vào bí mật của các bộ lọc; riêng Gamma được cung cấp mức suy giảm đã biết.”</w:t>
       </w:r>
     </w:p>
     <w:p>
@@ -2840,7 +2868,7 @@
         <w:pStyle w:val="u2"/>
       </w:pPr>
       <w:r>
-        <w:t>Kiến thức phải hiểu</w:t>
+        <w:t>Cách giải thích hai nhánh đánh giá</w:t>
       </w:r>
     </w:p>
     <w:p>
@@ -2848,44 +2876,28 @@
         <w:rPr>
           <w:b/>
         </w:rPr>
-        <w:t>Tăng cường ảnh</w:t>
-      </w:r>
-      <w:r>
-        <w:t xml:space="preserve"> nhằm cải thiện đặc tính hữu ích hoặc khả năng quan sát cho một mục tiêu. </w:t>
-      </w:r>
+        <w:t>Đầu vào chung là ảnh sạch đã tiền xử lý. Từ một ảnh suy giảm, chạy riêng từng ứng viên để có đối chứng công bằng; không áp dụng nối tiếp toàn bộ các phương pháp. Nhánh chất lượng dùng ảnh sạch làm tham chiếu khi tính metric. Nhánh nhận diện chỉ cần trạng thái ảnh đang xét và một checkpoint cố định.</w:t>
+      </w:r>
+    </w:p>
+    <w:p>
+      <w:r>
+        <w:t>Train học trọng số MobileNetV2. Validation chọn tham số cho mỗi bộ loại, mức và phương pháp; sau đó khóa cấu hình. Test chỉ dùng đánh giá. Giữ cùng degraded array và seed cho các phương pháp trong một điều kiện để khác biệt quan sát gắn với phương pháp thay vì một lần lấy mẫu nhiễu khác.</w:t>
+      </w:r>
+    </w:p>
+    <w:p>
       <w:r>
         <w:rPr>
           <w:b/>
         </w:rPr>
-        <w:t>Phục hồi ảnh</w:t>
-      </w:r>
-      <w:r>
-        <w:t xml:space="preserve"> thường gắn với việc giảm tác động của một mô hình suy giảm. Trong bài này nhiều kỹ thuật là phép hiệu chỉnh gần đúng; không phải mọi kỹ thuật đều nghịch đảo chính xác quá trình tạo ảnh.</w:t>
+        <w:t>Lưu ý khi được hỏi: clean tham gia chấm full-reference, không được đưa vào bộ lọc để biết đáp án. Gamma là ngoại lệ về thông tin cơ chế: nó được biết mức gamma của phép làm tối. Hạn chế này cần nói khi suy rộng sang ảnh tối thực.</w:t>
       </w:r>
     </w:p>
     <w:p>
       <w:r>
-        <w:t xml:space="preserve">Biên là nơi cường độ hoặc màu thay đổi nhanh. Texture là họa tiết lặp hoặc chi tiết bề mặt. Nhiễu cũng có thể tạo biến đổi nhanh. Vì vậy </w:t>
-      </w:r>
-      <w:r>
         <w:rPr>
-          <w:b/>
+          <w:i/>
         </w:rPr>
-        <w:t>tăng năng lượng cao tần chưa đủ chứng minh đã phục hồi chi tiết thật</w:t>
-      </w:r>
-      <w:r>
-        <w:t>. Khi giải thích một bảng, hãy liên hệ cơ chế của thuật toán với loại thông tin nó làm mất hoặc giữ lại.</w:t>
-      </w:r>
-    </w:p>
-    <w:p>
-      <w:r>
-        <w:rPr>
-          <w:b/>
-        </w:rPr>
-        <w:t>Hỏi: Ảnh đẹp hơn là thành công chưa?</w:t>
-      </w:r>
-      <w:r>
-        <w:t xml:space="preserve"> “Cần xác định mục tiêu: gần ảnh gốc, dễ quan sát hay tăng F1. Ba mục tiêu có thể không cùng tăng.”</w:t>
+        <w:t>Người trình bày: Trịnh Ngọc Nga. Chuyển ý: “Nhóm bắt đầu từ bộ dữ liệu và cách chia tập để tránh lẫn ảnh giữa học và đánh giá.”</w:t>
       </w:r>
     </w:p>
     <w:p>
@@ -2897,14 +2909,14 @@
           <w:i/>
           <w:sz w:val="19"/>
         </w:rPr>
-        <w:t>Nguồn đối chiếu: slide 4; báo cáo chương 2, mục 4.6; src/enhancements.py.</w:t>
+        <w:t>Nguồn đối chiếu: slide 4; báo cáo mục 1.3, 4.7 và 5.1; src/evaluate.py; src/experiment_matrix.py.</w:t>
       </w:r>
     </w:p>
     <w:p>
       <w:pPr>
         <w:pStyle w:val="u1"/>
       </w:pPr>
-      <w:bookmarkStart w:id="4" w:name="_Toc243287438"/>
+      <w:bookmarkStart w:id="4" w:name="_Toc243605028"/>
       <w:r>
         <w:t>Slide 05 Dữ liệu và chia tập theo nhóm hash</w:t>
       </w:r>
@@ -2920,7 +2932,7 @@
     </w:p>
     <w:p>
       <w:r>
-        <w:t>“Bộ dữ liệu có 3.670 ảnh hợp lệ thuộc năm lớp. Train có 2.571 ảnh để học trọng số; Validation có 549 ảnh để theo dõi huấn luyện và chọn tham số; Test có 550 ảnh để đánh giá cuối. Dandelion có nhiều ảnh nhất, nên ngoài Accuracy nhóm dùng Macro F1 để mỗi lớp có trọng số ngang nhau. Audit ghi nhận ba nhóm trùng SHA-256, trong đó có một nhóm chéo nhãn. Các ảnh cùng hash được giữ chung tập để tránh trùng nội dung chính xác đi qua Train và Test.”</w:t>
+        <w:t>“Dữ liệu có 3.670 ảnh hợp lệ thuộc năm lớp. Train gồm 2.571 ảnh để học trọng số, Validation có 549 ảnh để chọn tham số, còn Test có 550 ảnh để đánh giá cuối. Những tệp trùng SHA-256 được giữ trong cùng một tập. Audit ghi nhận ba nhóm trùng, trong đó một nhóm chéo nhãn cần xác minh; không có giao hash giữa các tập.”</w:t>
       </w:r>
     </w:p>
     <w:tbl>
@@ -2963,6 +2975,7 @@
           </w:tcPr>
           <w:p>
             <w:pPr>
+              <w:keepNext/>
               <w:spacing w:before="20" w:after="20" w:line="252" w:lineRule="auto"/>
             </w:pPr>
             <w:r>
@@ -2971,6 +2984,7 @@
                 <w:color w:val="FFFFFF"/>
                 <w:sz w:val="20"/>
               </w:rPr>
+              <w:lastRenderedPageBreak/>
               <w:t>Lớp</w:t>
             </w:r>
           </w:p>
@@ -2995,6 +3009,7 @@
           </w:tcPr>
           <w:p>
             <w:pPr>
+              <w:keepNext/>
               <w:spacing w:before="20" w:after="20" w:line="252" w:lineRule="auto"/>
             </w:pPr>
             <w:r>
@@ -3027,6 +3042,7 @@
           </w:tcPr>
           <w:p>
             <w:pPr>
+              <w:keepNext/>
               <w:spacing w:before="20" w:after="20" w:line="252" w:lineRule="auto"/>
               <w:jc w:val="center"/>
             </w:pPr>
@@ -3060,6 +3076,7 @@
           </w:tcPr>
           <w:p>
             <w:pPr>
+              <w:keepNext/>
               <w:spacing w:before="20" w:after="20" w:line="252" w:lineRule="auto"/>
               <w:jc w:val="center"/>
             </w:pPr>
@@ -3093,6 +3110,7 @@
           </w:tcPr>
           <w:p>
             <w:pPr>
+              <w:keepNext/>
               <w:spacing w:before="20" w:after="20" w:line="252" w:lineRule="auto"/>
               <w:jc w:val="center"/>
             </w:pPr>
@@ -4112,6 +4130,14 @@
       </w:r>
     </w:p>
     <w:p>
+      <w:r>
+        <w:rPr>
+          <w:i/>
+        </w:rPr>
+        <w:t>Người trình bày: Trịnh Ngọc Nga. Chuyển ý: “Sau khi chia tập, mọi ảnh đi qua cùng một cách tiền xử lý.”</w:t>
+      </w:r>
+    </w:p>
+    <w:p>
       <w:pPr>
         <w:spacing w:before="60"/>
       </w:pPr>
@@ -4127,9 +4153,9 @@
       <w:pPr>
         <w:pStyle w:val="u1"/>
       </w:pPr>
-      <w:bookmarkStart w:id="5" w:name="_Toc243287439"/>
-      <w:r>
-        <w:t>Slide 06 Tiền xử lý và không gian màu</w:t>
+      <w:bookmarkStart w:id="5" w:name="_Toc243605029"/>
+      <w:r>
+        <w:t>Slide 06 Tiền xử lý thống nhất cho mọi ảnh</w:t>
       </w:r>
       <w:bookmarkEnd w:id="5"/>
     </w:p>
@@ -4143,7 +4169,7 @@
     </w:p>
     <w:p>
       <w:r>
-        <w:t>“Ảnh được sửa hướng EXIF, chuyển RGB và đưa về 224 nhân 224 bằng letterbox với nội suy LANCZOS. Letterbox giữ tỷ lệ hình học rồi thêm viền, tránh kéo méo hình bông hoa. Các phép xử lý làm việc trên RGB uint8 từ 0 đến 255. Khi đưa vào model, dữ liệu được đổi float32 nhưng vẫn ở miền 0–255; phép preprocess_input của MobileNetV2 đã nằm trong graph. Nhóm không chuẩn hóa lại lần thứ hai ở bên ngoài. RGB, HSV và Lab được dùng vì mỗi không gian thuận tiện cho một dạng biến đổi khác nhau.”</w:t>
+        <w:t>“Ảnh được sửa hướng EXIF, chuyển RGB và letterbox LANCZOS về 224 nhân 224. Letterbox giữ tỷ lệ rồi thêm viền, tránh kéo méo hình hoa. Các phép xử lý dùng RGB uint8 từ 0 đến 255; khi suy luận chỉ đổi sang float32 vẫn ở miền đó. preprocess_input của MobileNetV2 đã nằm trong graph, nên không chuẩn hóa thêm một lần ở ngoài.”</w:t>
       </w:r>
     </w:p>
     <w:p>
@@ -4193,6 +4219,15 @@
       </w:r>
     </w:p>
     <w:p>
+      <w:r>
+        <w:rPr>
+          <w:i/>
+        </w:rPr>
+        <w:lastRenderedPageBreak/>
+        <w:t>Người trình bày: Trịnh Ngọc Nga. Chuyển ý: “Từ ảnh đã chuẩn hóa cách biểu diễn, nhóm mô phỏng năm dạng suy giảm với ba mức.”</w:t>
+      </w:r>
+    </w:p>
+    <w:p>
       <w:pPr>
         <w:spacing w:before="60"/>
       </w:pPr>
@@ -4208,7 +4243,7 @@
       <w:pPr>
         <w:pStyle w:val="u1"/>
       </w:pPr>
-      <w:bookmarkStart w:id="6" w:name="_Toc243287440"/>
+      <w:bookmarkStart w:id="6" w:name="_Toc243605030"/>
       <w:r>
         <w:t>Slide 07 Năm dạng suy giảm ở ba mức</w:t>
       </w:r>
@@ -4224,7 +4259,7 @@
     </w:p>
     <w:p>
       <w:r>
-        <w:t>“Nhóm mô phỏng năm cơ chế. Thiếu sáng dùng lũy thừa Gamma lớn hơn một. Nhiễu Gaussian cộng nhiễu có trung bình không và độ lệch chuẩn 10, 25 hoặc 50. Nhiễu muối tiêu thay một tỷ lệ pixel bằng đen hoặc trắng. Mờ Gaussian làm trộn lân cận với sigma tăng dần. Ám màu tăng gain đỏ và giảm gain lam. Cần phân biệt sigma của nhiễu với sigma của bộ lọc: một bên là độ lớn nhiễu cường độ, bên kia là độ rộng làm mượt trong không gian.”</w:t>
+        <w:t>“Năm dạng gồm thiếu sáng, nhiễu Gaussian, nhiễu muối tiêu, mờ Gaussian và ám màu. Mỗi dạng có ba mức nhẹ, vừa và mạnh theo bảng. Sigma của nhiễu đo độ lớn nhiễu cộng vào pixel, còn sigma của mờ điều khiển độ làm trơn trong không gian. Loại và mức suy giảm do thí nghiệm cung cấp, chưa được hệ thống tự ước lượng từ ảnh thực.”</w:t>
       </w:r>
     </w:p>
     <w:tbl>
@@ -4266,6 +4301,7 @@
           </w:tcPr>
           <w:p>
             <w:pPr>
+              <w:keepNext/>
               <w:spacing w:before="20" w:after="20" w:line="252" w:lineRule="auto"/>
             </w:pPr>
             <w:r>
@@ -4274,7 +4310,6 @@
                 <w:color w:val="FFFFFF"/>
                 <w:sz w:val="20"/>
               </w:rPr>
-              <w:lastRenderedPageBreak/>
               <w:t>Suy giảm</w:t>
             </w:r>
           </w:p>
@@ -4299,6 +4334,7 @@
           </w:tcPr>
           <w:p>
             <w:pPr>
+              <w:keepNext/>
               <w:spacing w:before="20" w:after="20" w:line="252" w:lineRule="auto"/>
             </w:pPr>
             <w:r>
@@ -4331,6 +4367,7 @@
           </w:tcPr>
           <w:p>
             <w:pPr>
+              <w:keepNext/>
               <w:spacing w:before="20" w:after="20" w:line="252" w:lineRule="auto"/>
               <w:jc w:val="center"/>
             </w:pPr>
@@ -4364,6 +4401,7 @@
           </w:tcPr>
           <w:p>
             <w:pPr>
+              <w:keepNext/>
               <w:spacing w:before="20" w:after="20" w:line="252" w:lineRule="auto"/>
               <w:jc w:val="center"/>
             </w:pPr>
@@ -5063,6 +5101,14 @@
       </w:r>
     </w:p>
     <w:p>
+      <w:r>
+        <w:rPr>
+          <w:i/>
+        </w:rPr>
+        <w:t>Người trình bày: Trịnh Ngọc Nga. Chuyển ý: “Với từng cơ chế suy giảm, nhóm chọn các phép xử lý tương ứng, bắt đầu từ ảnh thiếu sáng.”</w:t>
+      </w:r>
+    </w:p>
+    <w:p>
       <w:pPr>
         <w:spacing w:before="60"/>
       </w:pPr>
@@ -5079,7 +5125,7 @@
         <w:pStyle w:val="u1"/>
         <w:pageBreakBefore/>
       </w:pPr>
-      <w:bookmarkStart w:id="7" w:name="_Toc243287441"/>
+      <w:bookmarkStart w:id="7" w:name="_Toc243605031"/>
       <w:r>
         <w:lastRenderedPageBreak/>
         <w:t>Slide 08 Gamma và CLAHE</w:t>
@@ -5096,7 +5142,7 @@
     </w:p>
     <w:p>
       <w:r>
-        <w:t>“Gamma dùng một ánh xạ phi tuyến toàn ảnh. Vì nhóm biết Gamma đã dùng để tạo thiếu sáng, nhóm áp dụng số mũ nghịch đảo để nâng sáng. Đây là lợi thế của thí nghiệm có mức suy giảm đã biết; chưa phải tự ước lượng chiếu sáng từ ảnh thực. CLAHE hoạt động khác: chia kênh V thành các vùng nhỏ, cân bằng histogram có giới hạn và nội suy giữa các vùng để tránh đường nối. Gamma thích hợp với biến đổi sáng toàn cục đã mô hình hóa; CLAHE điều chỉnh tương phản cục bộ nhưng có thể làm nổi nhiễu.”</w:t>
+        <w:t>“Gamma ánh xạ cường độ toàn cục bằng số mũ nghịch đảo của phép làm tối đã biết. CLAHE chia kênh V trong HSV thành các vùng, cắt histogram để hạn chế khuếch đại rồi nội suy giữa vùng. HSV gồm H là sắc độ, S là độ bão hòa và V là thành phần độ sáng theo biểu diễn này. Dải ảnh phía dưới chỉ minh họa phép xử lý trên một ảnh; kết quả toàn Test được trình bày sau. Gamma không đảo được hoàn toàn mất mát do ép uint8, còn CLAHE có thể làm nổi nhiễu.”</w:t>
       </w:r>
     </w:p>
     <w:p>
@@ -5343,6 +5389,14 @@
       </w:r>
     </w:p>
     <w:p>
+      <w:r>
+        <w:rPr>
+          <w:i/>
+        </w:rPr>
+        <w:t>Người trình bày: Trịnh Ngọc Nga. Chuyển ý: “Khi ảnh bị nhiễu, cần thao tác lên lân cận thay vì chỉ đổi cường độ từng pixel.”</w:t>
+      </w:r>
+    </w:p>
+    <w:p>
       <w:pPr>
         <w:spacing w:before="60"/>
       </w:pPr>
@@ -5358,7 +5412,7 @@
       <w:pPr>
         <w:pStyle w:val="u1"/>
       </w:pPr>
-      <w:bookmarkStart w:id="8" w:name="_Toc243287442"/>
+      <w:bookmarkStart w:id="8" w:name="_Toc243605032"/>
       <w:r>
         <w:t>Slide 09 Gaussian và median</w:t>
       </w:r>
@@ -5374,11 +5428,11 @@
     </w:p>
     <w:p>
       <w:r>
-        <w:t xml:space="preserve">“Gaussian thay pixel bằng tổng có trọng số của lân cận, trong đó pixel gần tâm có trọng số lớn hơn. Nó làm dịu biến động nhanh nên giảm nhiễu nhưng cũng có thể làm mờ biên và texture. Median lấy trung vị trong cửa sổ, nên ít bị kéo bởi vài giá trị cực đoan. Vì muối tiêu tạo các outlier 0 hoặc 255, median </w:t>
+        <w:t xml:space="preserve">“Gaussian lấy trung bình có trọng số theo khoảng cách, nên làm mượt nhưng có thể trộn qua biên. Median lấy trung vị trong cửa sổ, vì thế ít bị một số pixel cực trị chi phối. Ví dụ tám pixel bằng 10 và </w:t>
       </w:r>
       <w:r>
         <w:lastRenderedPageBreak/>
-        <w:t>phù hợp trực tiếp với cơ chế này. Trong ví dụ tám giá trị 10 và một giá trị 255, median vẫn là 10 trong khi trung bình đều khoảng 37,22. Đây chỉ là ví dụ giải thích, không phải kết quả thực nghiệm.”</w:t>
+        <w:t>một pixel bằng 255 có trung vị 10, còn trung bình đều khoảng 37,22; đây là so với trung bình đều, không phải phép tính chính xác của Gaussian có trọng số. Dải ảnh cùng một nhiễu xung giúp quan sát sự khác nhau; cửa sổ quá lớn vẫn có thể xóa chi tiết.”</w:t>
       </w:r>
     </w:p>
     <w:p>
@@ -5513,6 +5567,14 @@
       </w:r>
     </w:p>
     <w:p>
+      <w:r>
+        <w:rPr>
+          <w:i/>
+        </w:rPr>
+        <w:t>Người trình bày: Trịnh Ngọc Nga. Chuyển ý: “Bilateral bổ sung một điều kiện nữa để giảm trộn qua biên: độ gần nhau về màu.”</w:t>
+      </w:r>
+    </w:p>
+    <w:p>
       <w:pPr>
         <w:spacing w:before="60"/>
       </w:pPr>
@@ -5528,7 +5590,7 @@
       <w:pPr>
         <w:pStyle w:val="u1"/>
       </w:pPr>
-      <w:bookmarkStart w:id="9" w:name="_Toc243287443"/>
+      <w:bookmarkStart w:id="9" w:name="_Toc243605033"/>
       <w:r>
         <w:t>Slide 10 Bilateral giữ biên bằng khoảng cách màu</w:t>
       </w:r>
@@ -5544,7 +5606,7 @@
     </w:p>
     <w:p>
       <w:r>
-        <w:t>“Bilateral vẫn là trung bình có trọng số nhưng dùng hai điều kiện: gần nhau trong không gian và giống nhau về màu. Nhờ thành phần màu, pixel nằm sát nhau nhưng khác màu mạnh qua một biên sẽ ít trộn vào nhau. Tuy nhiên nhiễu mạnh cũng làm pixel cùng vùng có màu khác nhau. Khi đó bilateral có thể nhầm biến động nhiễu là khác biệt cần giữ. Vì vậy khả năng giữ biên không có nghĩa bilateral luôn khử nhiễu tốt hơn Gaussian.”</w:t>
+        <w:t>“Bilateral nhân hai trọng số: khoảng cách không gian và khoảng cách màu. Một pixel gần vị trí nhưng khác màu nhiều sẽ đóng góp ít. Sigma s được giữ 1,6 trong cửa sổ 5 nhân 5; sigma r được thử ở 25, 40 và 60. Sigma r nhỏ có thể giữ biên nhưng cũng giữ nhiễu mạnh; sigma r lớn làm mượt hơn. Hình minh họa dùng nhiễu Gaussian vừa, còn kết quả theo ba mức sẽ được đối chiếu ở phần thực nghiệm.”</w:t>
       </w:r>
     </w:p>
     <w:p>
@@ -5626,7 +5688,11 @@
         <w:t>Sigma range nhỏ</w:t>
       </w:r>
       <w:r>
-        <w:t xml:space="preserve"> loại pixel khác màu mạnh, giữ biên nhưng có thể giữ cả nhiễu. </w:t>
+        <w:t xml:space="preserve"> loại pixel </w:t>
+      </w:r>
+      <w:r>
+        <w:lastRenderedPageBreak/>
+        <w:t xml:space="preserve">khác màu mạnh, giữ biên nhưng có thể giữ cả nhiễu. </w:t>
       </w:r>
       <w:r>
         <w:rPr>
@@ -5640,7 +5706,6 @@
     </w:p>
     <w:p>
       <w:r>
-        <w:lastRenderedPageBreak/>
         <w:t>Ví dụ minh họa cho riêng trọng số range: nếu độ dài sai khác màu bằng 60 và sigma range=60 thì trọng số range khoảng exp(−1/2)=0,607 trước khi nhân trọng số không gian. Nếu sai khác gấp đôi, trọng số giảm mạnh. Ví dụ này không dùng để tính trực tiếp F1.</w:t>
       </w:r>
     </w:p>
@@ -5653,6 +5718,14 @@
       </w:r>
       <w:r>
         <w:t xml:space="preserve"> “Điều quan sát được là cấu hình đã thử kém hơn. Cơ chế có thể phù hợp là nhiễu làm sai khoảng cách màu và cửa sổ bị giới hạn 5×5; chưa có ablation để khẳng định một nguyên nhân duy nhất.”</w:t>
+      </w:r>
+    </w:p>
+    <w:p>
+      <w:r>
+        <w:rPr>
+          <w:i/>
+        </w:rPr>
+        <w:t>Người trình bày: Trịnh Ngọc Nga. Chuyển ý: “Với ảnh mờ, mục tiêu chuyển sang tăng phần chi tiết còn lại.”</w:t>
       </w:r>
     </w:p>
     <w:p>
@@ -5671,7 +5744,7 @@
       <w:pPr>
         <w:pStyle w:val="u1"/>
       </w:pPr>
-      <w:bookmarkStart w:id="10" w:name="_Toc243287444"/>
+      <w:bookmarkStart w:id="10" w:name="_Toc243605034"/>
       <w:r>
         <w:t>Slide 11 Unsharp mask và sharpening</w:t>
       </w:r>
@@ -5687,7 +5760,7 @@
     </w:p>
     <w:p>
       <w:r>
-        <w:t>“Unsharp mask tạo một bản mượt B của ảnh I, lấy phần dư D bằng I trừ B rồi cộng một phần D vào ảnh ban đầu. Phần dư nhấn vào nơi thay đổi nhanh, làm cạnh có tương phản cao hơn. Tham số radius điều khiển độ rộng làm mượt, amount điều khiển mức cộng phần dư. Sharpening trong bài là PIL SHARPEN cố định. Hai phương pháp có thể làm ảnh trông nét hơn nhưng không bảo đảm khôi phục những chi tiết đã mất bởi mờ.”</w:t>
+        <w:t>“Unsharp mask tạo bản làm trơn B, lấy phần dư I trừ B rồi cộng phần dư có trọng số vào ảnh. Tham số radius trong code thực chất là sigma Gaussian; amount điều khiển mức cộng. Nhóm thử ba cặp tham số như trên slide và dùng PIL SHARPEN cố định làm đối chứng. Hình phía dưới cho thấy cơ chế làm sắc nét trên ảnh mờ mạnh. Việc tăng biên có thể tăng cả nhiễu hoặc halo và không phải giải chập lấy lại toàn bộ thông tin đã mất.”</w:t>
       </w:r>
     </w:p>
     <w:p>
@@ -5758,6 +5831,14 @@
       </w:r>
     </w:p>
     <w:p>
+      <w:r>
+        <w:rPr>
+          <w:i/>
+        </w:rPr>
+        <w:t>Người trình bày: Trịnh Ngọc Nga. Chuyển ý: “Nhóm cuối cùng thay đổi các kênh màu; đây là nơi giả định về cảnh rất quan trọng.”</w:t>
+      </w:r>
+    </w:p>
+    <w:p>
       <w:pPr>
         <w:spacing w:before="60"/>
       </w:pPr>
@@ -5773,7 +5854,7 @@
       <w:pPr>
         <w:pStyle w:val="u1"/>
       </w:pPr>
-      <w:bookmarkStart w:id="11" w:name="_Toc243287445"/>
+      <w:bookmarkStart w:id="11" w:name="_Toc243605035"/>
       <w:r>
         <w:t>Slide 12 Hiệu chỉnh màu và giả định trung tính</w:t>
       </w:r>
@@ -5789,7 +5870,11 @@
     </w:p>
     <w:p>
       <w:r>
-        <w:t>“Ba phương pháp màu dựa trên giả định khác nhau. RGB balance dùng giả định gray-world: trung bình các kênh của cảnh nên gần một màu trung tính. HSV correction giảm Saturation 8% rồi cân bằng Value bằng histogram có clipping trên toàn ảnh. Lab correction đưa trung bình a* và b* về không rồi kéo giãn L* theo percentile. Những giả định này có thể sai với ảnh hoa có một màu trội tự nhiên. Do đó hiệu chỉnh có thể tạo thêm sai khác màu, thay vì sửa ám màu.”</w:t>
+        <w:t xml:space="preserve">“RGB balance điều chỉnh gain để trung bình ba kênh tiến về cùng mức, dựa trên giả định gray-world. HSV correction giảm S và cân bằng histogram V trên toàn ảnh; nó khác CLAHE theo từng vùng. Lab </w:t>
+      </w:r>
+      <w:r>
+        <w:lastRenderedPageBreak/>
+        <w:t>tách L là độ sáng cảm nhận và a, b là hai trục màu; cách cài đặt hiện tại đưa trung bình a, b về không và kéo giãn L theo phân vị. Hình phía dưới minh họa ảnh ám màu nhẹ sau HSV, chưa phải bằng chứng mọi ảnh sẽ được sửa tốt. Cảnh hoa có màu trội có thể vi phạm giả định trung tính.”</w:t>
       </w:r>
     </w:p>
     <w:p>
@@ -5811,11 +5896,7 @@
         <w:t>Ví dụ minh họa:</w:t>
       </w:r>
       <w:r>
-        <w:t xml:space="preserve"> mean=(120,100,80), </w:t>
-      </w:r>
-      <w:r>
-        <w:lastRenderedPageBreak/>
-        <w:t>mức đích=100 thì gain xấp xỉ (0,833;1;1,25). Kênh đỏ giảm, lam tăng. Nếu cảnh vốn chứa nhiều cánh đỏ thật, phép cân bằng có thể nhầm màu đối tượng với màu nguồn sáng. Gray-world là giả định, không phải định luật mọi cảnh đều đúng.</w:t>
+        <w:t xml:space="preserve"> mean=(120,100,80), mức đích=100 thì gain xấp xỉ (0,833;1;1,25). Kênh đỏ giảm, lam tăng. Nếu cảnh vốn chứa nhiều cánh đỏ thật, phép cân bằng có thể nhầm màu đối tượng với màu nguồn sáng. Gray-world là giả định, không phải định luật mọi cảnh đều đúng.</w:t>
       </w:r>
     </w:p>
     <w:p>
@@ -5874,6 +5955,14 @@
       </w:r>
     </w:p>
     <w:p>
+      <w:r>
+        <w:rPr>
+          <w:i/>
+        </w:rPr>
+        <w:t>Người trình bày: Trịnh Ngọc Nga. Chuyển ý: “Sau khi biết các phép biến đổi, cần xác định rõ hai tiêu chí dùng để đánh giá chúng.”</w:t>
+      </w:r>
+    </w:p>
+    <w:p>
       <w:pPr>
         <w:spacing w:before="60"/>
       </w:pPr>
@@ -5889,9 +5978,9 @@
       <w:pPr>
         <w:pStyle w:val="u1"/>
       </w:pPr>
-      <w:bookmarkStart w:id="12" w:name="_Toc243287446"/>
-      <w:r>
-        <w:t>Slide 13 Đọc đồng thời nhiễu biên chi tiết và màu</w:t>
+      <w:bookmarkStart w:id="12" w:name="_Toc243605036"/>
+      <w:r>
+        <w:t>Slide 13 Chất lượng ảnh và nhận diện được đo riêng</w:t>
       </w:r>
       <w:bookmarkEnd w:id="12"/>
     </w:p>
@@ -5905,7 +5994,7 @@
     </w:p>
     <w:p>
       <w:r>
-        <w:t>“Nhóm không đánh giá chất lượng ảnh chỉ bằng một con số. Lọc mạnh có thể giảm nhiễu nhưng xóa cấu trúc mảnh. Gradient cao có thể do biên thật, nhưng cũng có thể do nhiễu hoặc halo. Histogram rộng chỉ cho biết phân bố cường độ trải rộng hơn, chưa cho biết chi tiết có đúng hay không. Vì vậy nhóm xem ảnh clean, degraded và enhanced cùng nhau, sau đó đối chiếu PSNR, SSIM, sai khác màu và kết quả nhận diện.”</w:t>
+        <w:t>“Nhóm đo hai kết quả khác nhau. Chất lượng ảnh so trạng thái đang xét với ảnh sạch tham chiếu. Nhận diện dùng cùng một MobileNetV2 đã huấn luyện trên Train và giữ nguyên trọng số khi đánh giá mọi điều kiện. F1 từng lớp kết hợp Precision và Recall; Macro F1 lấy trung bình F1 của năm lớp với trọng số ngang nhau. Vì thế ảnh có SSIM cao hơn vẫn có thể mang dấu hiệu khiến classifier dự đoán sai. Nhóm giữ cả ảnh suy giảm chưa xử lý làm đối chứng.”</w:t>
       </w:r>
     </w:p>
     <w:p>
@@ -5913,12 +6002,12 @@
         <w:pStyle w:val="u2"/>
       </w:pPr>
       <w:r>
-        <w:t>Quy trình đọc ảnh và metric</w:t>
+        <w:t>MobileNetV2 và Macro F1 cần giải thích trước khi tuning</w:t>
       </w:r>
     </w:p>
     <w:p>
       <w:r>
-        <w:t>Đầu tiên tìm vị trí đối tượng ở ảnh sạch: mép cánh, tâm hoa và vùng có texture. Ở ảnh suy giảm, xác định loại biến đổi. Sau xử lý, kiểm tra nhiễu còn không, cạnh bị dày hoặc mờ không, vùng sáng có bị cháy không và màu hoa có bị đổi không. Cuối cùng dùng bảng số liệu để kiểm tra quan sát, không chọn một ảnh đẹp rồi suy rộng cho toàn bộ Test.</w:t>
+        <w:t>MobileNetV2 được khởi tạo từ ImageNet, học head rồi fine-tune trên Train với Validation để theo dõi. Khi đánh giá 49 điều kiện, cùng một checkpoint và class order được giữ cố định. Điều này giúp khảo sát tác động của thay đổi ảnh đầu vào lên một bộ phân loại cụ thể; không chứng minh mọi kiến trúc sẽ phản ứng giống nhau.</w:t>
       </w:r>
     </w:p>
     <w:p>
@@ -5926,24 +6015,27 @@
         <w:rPr>
           <w:b/>
         </w:rPr>
-        <w:t>Edge preservation ratio</w:t>
-      </w:r>
-      <w:r>
-        <w:t xml:space="preserve"> ở source là tỷ lệ năng lượng gradient Sobel trung bình của ảnh đang xét so ảnh sạch. Gần 1 có thể cho thấy mức năng lượng gần tham chiếu; lớn hơn 1 cũng có thể do nhiễu. Nó không đo trực tiếp vị trí từng cạnh có khớp hay không. </w:t>
+        <w:t xml:space="preserve">Với từng lớp, Precision = TP/(TP+FP), Recall = TP/(TP+FN), F1 = 2PR/(P+R). Macro F1 là trung bình F1 của năm lớp, không phải F1 tính từ Precision/Recall đã lấy trung bình. Accuracy </w:t>
       </w:r>
       <w:r>
         <w:rPr>
           <w:b/>
         </w:rPr>
-        <w:t>RMS contrast</w:t>
-      </w:r>
-      <w:r>
-        <w:t xml:space="preserve"> là độ lệch chuẩn cường độ xám, không phải tỷ số tương phản cực đại/cực tiểu.</w:t>
+        <w:lastRenderedPageBreak/>
+        <w:t>tính tỷ lệ đúng toàn tập. Dữ liệu các lớp không bằng nhau nên Macro F1 giúp trình bày kết quả mà mỗi lớp có trọng số ngang nhau.</w:t>
       </w:r>
     </w:p>
     <w:p>
       <w:r>
-        <w:t>Phần bảng cuối tài liệu giải thích Bảng 6.1, gồm vì sao năng lượng biên giảm sau khử nhiễu vẫn có thể là tiến bộ. Đây là mấu chốt nối cơ chế thuật toán với kết quả.</w:t>
+        <w:t>Ví dụ tính toán minh họa: Precision 0,8 và Recall 0,5 cho F1 khoảng 0,6154. Đây không phải một hàng Test của dự án. Chất lượng ảnh được đo với ảnh sạch bằng PSNR/SSIM/ΔE; Macro F1 dùng nhãn thật của 550 ảnh. Hai loại đánh giá có thể thay đổi khác hướng. Chương 6 và phần bảng sâu tiếp tục giải thích gradient, RMS contrast và giới hạn của từng metric.</w:t>
+      </w:r>
+    </w:p>
+    <w:p>
+      <w:r>
+        <w:rPr>
+          <w:i/>
+        </w:rPr>
+        <w:t>Người trình bày: Trịnh Ngọc Nga. Chuyển ý: “Em xin chuyển cho bạn Dương trình bày ma trận 49 điều kiện và quy tắc chọn tham số theo hai tiêu chí này.”</w:t>
       </w:r>
     </w:p>
     <w:p>
@@ -5955,17 +6047,16 @@
           <w:i/>
           <w:sz w:val="19"/>
         </w:rPr>
-        <w:t>Nguồn đối chiếu: slide 13; src/image_metrics.py, edge_energy, edge_preservation_ratio, rms_contrast; báo cáo mục 4.6 và 6.7.</w:t>
+        <w:t>Nguồn đối chiếu: slide 13; src/model.py; src/classification_metrics.py; src/tuning.py; models/model_metadata.json; báo cáo mục 2.6–2.7 và 5.2–5.3.</w:t>
       </w:r>
     </w:p>
     <w:p>
       <w:pPr>
         <w:pStyle w:val="u1"/>
       </w:pPr>
-      <w:bookmarkStart w:id="13" w:name="_Toc243287447"/>
-      <w:r>
-        <w:lastRenderedPageBreak/>
-        <w:t>Slide 14 Thiết kế 49 điều kiện</w:t>
+      <w:bookmarkStart w:id="13" w:name="_Toc243605037"/>
+      <w:r>
+        <w:t>Slide 14 49 điều kiện với tham số khóa trên Validation</w:t>
       </w:r>
       <w:bookmarkEnd w:id="13"/>
     </w:p>
@@ -5979,7 +6070,7 @@
     </w:p>
     <w:p>
       <w:r>
-        <w:t>“Ma trận gồm một điều kiện clean, năm dạng nhân ba mức thành 15 điều kiện suy giảm, và 33 điều kiện sau xử lý. Bốn dạng đầu có hai phương pháp cho mỗi mức nên tạo 24 điều kiện; ám màu có ba phương pháp cho mỗi mức nên tạo thêm chín. Mỗi điều kiện đánh giá trên cùng 550 ảnh, tổng cộng 26.950 lượt dự đoán. Tham số được chọn trên Validation theo Macro F1 cao nhất, nếu bằng nhau thì xét SSIM rồi thời gian enhancement thấp hơn; sau đó khóa cấu hình trước khi chạy Test.”</w:t>
+        <w:t>“Có một điều kiện ảnh sạch, năm dạng nhân ba mức thành 15 điều kiện suy giảm, và 33 điều kiện sau xử lý. Mỗi phương pháp được chọn cấu hình riêng trên Validation bằng Macro F1 cao nhất; nếu hòa thì dùng SSIM, rồi thời gian xử lý thấp hơn. Cấu hình được khóa trước khi chạy cùng 550 ảnh Test cho từng điều kiện, tạo 26.950 lượt dự đoán. Đây là tối ưu tham số ưu tiên nhận diện, chưa phải tối ưu riêng PSNR hoặc SSIM.”</w:t>
       </w:r>
     </w:p>
     <w:p>
@@ -6021,6 +6112,14 @@
       </w:r>
       <w:r>
         <w:t xml:space="preserve"> “Có thể mô tả phương pháp tốt nhất trong kết quả Test đã định trước, nhưng không dùng nó để thay đổi grid hay khóa lại tham số rồi vẫn coi điểm trên cùng Test là đánh giá mới độc lập.”</w:t>
+      </w:r>
+    </w:p>
+    <w:p>
+      <w:r>
+        <w:rPr>
+          <w:i/>
+        </w:rPr>
+        <w:t>Người trình bày: Nguyễn Tùng Dương. Chuyển ý: “Trước khi xem biểu đồ, em giải thích cách đọc các chỉ số chất lượng ảnh.”</w:t>
       </w:r>
     </w:p>
     <w:p>
@@ -6040,7 +6139,7 @@
         <w:pStyle w:val="u1"/>
         <w:pageBreakBefore/>
       </w:pPr>
-      <w:bookmarkStart w:id="14" w:name="_Toc243287448"/>
+      <w:bookmarkStart w:id="14" w:name="_Toc243605038"/>
       <w:r>
         <w:lastRenderedPageBreak/>
         <w:t>Slide 15 Metric chất lượng ảnh và cách diễn giải</w:t>
@@ -6057,7 +6156,7 @@
     </w:p>
     <w:p>
       <w:r>
-        <w:t>“PSNR phản ánh sai số pixel so ảnh sạch trên thang log, thường cao hơn là gần tham chiếu hơn. SSIM so sánh độ sáng, tương phản và cấu trúc cục bộ. ΔE2000 phản ánh sai khác màu trong Lab, thấp hơn thường tốt hơn. Nhóm tính trên đủ 550 ảnh Test, nhưng ở mỗi ảnh chỉ lấy lưới pixel cách bốn, từ 224×224 còn 56×56. Vì thế cần công bố đúng giao thức metric, không gọi đây là phép tính toàn bộ pixel ở 224×224.”</w:t>
+        <w:t>“PSNR được suy ra từ sai số bình phương trung bình MSE; sai số nhỏ hơn cho PSNR cao hơn, đơn vị dB. SSIM đánh giá mức giống nhau về độ sáng, tương phản và cấu trúc cục bộ. Delta E 2000 đo sai khác màu, thấp hơn thường tốt hơn. Nhóm chấm đủ 550 ảnh, nhưng mỗi ảnh lấy pixel cách bốn, thành lưới 56 nhân 56. Delta E được báo cáo cho ảnh sạch và nhóm ám màu. Macro F1 của slide trước phải được đọc riêng với các metric ảnh này.”</w:t>
       </w:r>
     </w:p>
     <w:p>
@@ -6147,16 +6246,7 @@
     </w:p>
     <w:p>
       <w:r>
-        <w:t xml:space="preserve">MSE là trung bình bình phương sai khác, cộng trên vị trí và kênh trong miền đang đánh giá. PSNR dùng mức cực đại 255. Nếu MSE giảm mười lần thì PSNR tăng 10 dB; nếu MSE giảm khoảng hai lần thì tăng khoảng 3,01 dB. </w:t>
-      </w:r>
-      <w:r>
-        <w:rPr>
-          <w:b/>
-        </w:rPr>
-        <w:t>Không chia hai giá trị dB để nói chất lượng ảnh tốt gấp bao nhiêu lần.</w:t>
-      </w:r>
-      <w:r>
-        <w:t xml:space="preserve"> Code trả PSNR=100 khi MSE gần không để tránh vô hạn; clean 100 dB là quy ước triển khai.</w:t>
+        <w:t>MSE là trung bình bình phương sai khác trên các vị trí và kênh được đo. PSNR là chỉ số log suy ra từ MSE, đơn vị dB; sai số nhỏ hơn cho PSNR cao hơn. Nếu MSE giảm mười lần thì PSNR tăng 10 dB. Không chia hai giá trị dB để nói chất lượng tốt gấp bao nhiêu lần. Code trả PSNR=100 khi MSE gần không để tránh vô hạn; clean 100 dB là quy ước triển khai.</w:t>
       </w:r>
     </w:p>
     <w:p>
@@ -6237,6 +6327,14 @@
       </w:r>
     </w:p>
     <w:p>
+      <w:r>
+        <w:rPr>
+          <w:i/>
+        </w:rPr>
+        <w:t>Người trình bày: Nguyễn Tùng Dương. Chuyển ý: “Đầu tiên là kết quả cải thiện ảnh thiếu sáng bằng Gamma và CLAHE.”</w:t>
+      </w:r>
+    </w:p>
+    <w:p>
       <w:pPr>
         <w:spacing w:before="60"/>
       </w:pPr>
@@ -6253,7 +6351,7 @@
         <w:pStyle w:val="u1"/>
         <w:pageBreakBefore/>
       </w:pPr>
-      <w:bookmarkStart w:id="15" w:name="_Toc243287449"/>
+      <w:bookmarkStart w:id="15" w:name="_Toc243605039"/>
       <w:r>
         <w:lastRenderedPageBreak/>
         <w:t>Slide 16 Thiếu sáng và giới hạn của nghịch đảo Gamma</w:t>
@@ -6270,7 +6368,7 @@
     </w:p>
     <w:p>
       <w:r>
-        <w:t>“Biểu đồ trái là PSNR, biểu đồ phải là SSIM; trục ngang đi từ thiếu sáng nhẹ đến mạnh. Ở cùng một mức, nhóm so đường suy giảm với Gamma và CLAHE. Với thiếu sáng nhẹ, Gamma đưa PSNR từ 21,06 lên 46,22 dB và SSIM từ 0,8650 lên 0,9924. Kết quả phù hợp với việc Gamma đang đảo đúng dạng biến đổi đã biết. Tuy nhiên ở mức mạnh, SSIM sau Gamma còn khoảng 0,829, cho thấy lượng tử hóa vùng tối vẫn để lại mất mát. Nhóm không coi đây là khôi phục hoàn hảo hay tự động xử lý mọi ảnh tối thực.”</w:t>
+        <w:t>“Ở mỗi mức, nhóm so hai phương pháp với cùng ảnh suy giảm. Thiếu sáng nhẹ sau Gamma có PSNR từ 21,06 lên 46,22 dB và SSIM từ 0,8650 lên 0,9924. Gamma có lợi thế vì được biết đúng mức biến đổi làm tối. Khi thiếu sáng mạnh, kết quả vẫn cách ảnh sạch vì lượng tử hóa đã gộp nhiều mức pixel. Đây là cải thiện trong mô phỏng có thông tin mức suy giảm, chưa chứng minh xử lý tự động mọi ảnh tối thực.”</w:t>
       </w:r>
     </w:p>
     <w:p>
@@ -6370,6 +6468,7 @@
           </w:tcPr>
           <w:p>
             <w:pPr>
+              <w:keepNext/>
               <w:spacing w:before="20" w:after="20" w:line="252" w:lineRule="auto"/>
             </w:pPr>
             <w:r>
@@ -6402,6 +6501,7 @@
           </w:tcPr>
           <w:p>
             <w:pPr>
+              <w:keepNext/>
               <w:spacing w:before="20" w:after="20" w:line="252" w:lineRule="auto"/>
             </w:pPr>
             <w:r>
@@ -6434,6 +6534,7 @@
           </w:tcPr>
           <w:p>
             <w:pPr>
+              <w:keepNext/>
               <w:spacing w:before="20" w:after="20" w:line="252" w:lineRule="auto"/>
               <w:jc w:val="center"/>
             </w:pPr>
@@ -6467,6 +6568,7 @@
           </w:tcPr>
           <w:p>
             <w:pPr>
+              <w:keepNext/>
               <w:spacing w:before="20" w:after="20" w:line="252" w:lineRule="auto"/>
               <w:jc w:val="center"/>
             </w:pPr>
@@ -6500,6 +6602,7 @@
           </w:tcPr>
           <w:p>
             <w:pPr>
+              <w:keepNext/>
               <w:spacing w:before="20" w:after="20" w:line="252" w:lineRule="auto"/>
               <w:jc w:val="center"/>
             </w:pPr>
@@ -6533,6 +6636,7 @@
           </w:tcPr>
           <w:p>
             <w:pPr>
+              <w:keepNext/>
               <w:spacing w:before="20" w:after="20" w:line="252" w:lineRule="auto"/>
               <w:jc w:val="center"/>
             </w:pPr>
@@ -8311,6 +8415,14 @@
       </w:r>
     </w:p>
     <w:p>
+      <w:r>
+        <w:rPr>
+          <w:i/>
+        </w:rPr>
+        <w:t>Người trình bày: Nguyễn Tùng Dương. Chuyển ý: “Sang nhiễu Gaussian, lựa chọn bộ lọc thay đổi theo độ mạnh của nhiễu.”</w:t>
+      </w:r>
+    </w:p>
+    <w:p>
       <w:pPr>
         <w:spacing w:before="60"/>
       </w:pPr>
@@ -8326,7 +8438,7 @@
       <w:pPr>
         <w:pStyle w:val="u1"/>
       </w:pPr>
-      <w:bookmarkStart w:id="16" w:name="_Toc243287450"/>
+      <w:bookmarkStart w:id="16" w:name="_Toc243605040"/>
       <w:r>
         <w:t>Slide 17 Khử nhiễu Gaussian và mức làm mượt</w:t>
       </w:r>
@@ -8342,7 +8454,7 @@
     </w:p>
     <w:p>
       <w:r>
-        <w:t>“Ở nhiễu Gaussian nhẹ và vừa, bilateral có PSNR/SSIM cao hơn Gaussian trong cấu hình đã khóa. Nhưng khi nhiễu mạnh, thứ tự đảo lại: Gaussian đạt PSNR 21,61 dB và SSIM khoảng 0,617, còn bilateral đạt 19,78 dB và khoảng 0,540. Macro F1 sau Gaussian là 0,6959, cao hơn bilateral 0,6719. Điều này cho thấy việc giữ khác biệt màu chỉ hữu ích khi khác biệt ấy còn phản ánh cấu trúc thật; nhiễu mạnh có thể làm khoảng cách màu trở nên kém tin cậy.”</w:t>
+        <w:t>“Bilateral có PSNR và SSIM cao hơn Gaussian ở nhiễu nhẹ và vừa trong cấu hình đã khóa. Ở mức mạnh, thứ tự đảo lại: Gaussian đạt 21,61 dB và SSIM 0,6172; bilateral khoảng 19,78 dB và 0,540. Vì vậy không có một phương pháp thắng ở mọi mức. Giải thích theo cơ chế là nhiễu mạnh có thể làm khoảng cách màu kém tin cậy, nhưng bài chưa có ablation để tách riêng nguyên nhân này.”</w:t>
       </w:r>
     </w:p>
     <w:p>
@@ -8442,6 +8554,7 @@
           </w:tcPr>
           <w:p>
             <w:pPr>
+              <w:keepNext/>
               <w:spacing w:before="20" w:after="20" w:line="252" w:lineRule="auto"/>
             </w:pPr>
             <w:r>
@@ -8474,6 +8587,7 @@
           </w:tcPr>
           <w:p>
             <w:pPr>
+              <w:keepNext/>
               <w:spacing w:before="20" w:after="20" w:line="252" w:lineRule="auto"/>
             </w:pPr>
             <w:r>
@@ -8506,6 +8620,7 @@
           </w:tcPr>
           <w:p>
             <w:pPr>
+              <w:keepNext/>
               <w:spacing w:before="20" w:after="20" w:line="252" w:lineRule="auto"/>
               <w:jc w:val="center"/>
             </w:pPr>
@@ -8539,6 +8654,7 @@
           </w:tcPr>
           <w:p>
             <w:pPr>
+              <w:keepNext/>
               <w:spacing w:before="20" w:after="20" w:line="252" w:lineRule="auto"/>
               <w:jc w:val="center"/>
             </w:pPr>
@@ -8572,6 +8688,7 @@
           </w:tcPr>
           <w:p>
             <w:pPr>
+              <w:keepNext/>
               <w:spacing w:before="20" w:after="20" w:line="252" w:lineRule="auto"/>
               <w:jc w:val="center"/>
             </w:pPr>
@@ -8605,6 +8722,7 @@
           </w:tcPr>
           <w:p>
             <w:pPr>
+              <w:keepNext/>
               <w:spacing w:before="20" w:after="20" w:line="252" w:lineRule="auto"/>
               <w:jc w:val="center"/>
             </w:pPr>
@@ -10380,6 +10498,14 @@
       </w:r>
     </w:p>
     <w:p>
+      <w:r>
+        <w:rPr>
+          <w:i/>
+        </w:rPr>
+        <w:t>Người trình bày: Nguyễn Tùng Dương. Chuyển ý: “Với nhiễu xung, các pixel cực trị khiến median thể hiện lợi thế rõ hơn.”</w:t>
+      </w:r>
+    </w:p>
+    <w:p>
       <w:pPr>
         <w:spacing w:before="60"/>
       </w:pPr>
@@ -10395,7 +10521,7 @@
       <w:pPr>
         <w:pStyle w:val="u1"/>
       </w:pPr>
-      <w:bookmarkStart w:id="17" w:name="_Toc243287451"/>
+      <w:bookmarkStart w:id="17" w:name="_Toc243605041"/>
       <w:r>
         <w:t>Slide 18 Khử nhiễu xung bằng bộ lọc trung vị</w:t>
       </w:r>
@@ -10411,7 +10537,7 @@
     </w:p>
     <w:p>
       <w:r>
-        <w:t>“Đây là trường hợp median khớp rõ với cơ chế suy giảm. Ở nhiễu xung mạnh, PSNR tăng từ 15,68 lên 28,90 dB và SSIM tăng từ khoảng 0,541 lên 0,955. Macro F1 tăng từ 0,6863 lên 0,8869. Median loại các outlier khi lân cận còn đủ tín hiệu hợp lệ, trong khi Gaussian trộn outlier vào các giá trị quanh nó. Dù cải thiện lớn, F1 sau median vẫn thấp hơn clean 0,9020 và một số ảnh vẫn sai.”</w:t>
+        <w:t>“Ở nhiễu xung mạnh, median đưa PSNR từ 15,68 lên 28,90 dB và SSIM từ 0,5410 lên 0,9548. Đường median cao hơn Gaussian ở cả ba mức trên hai chỉ số trong thí nghiệm này. Kết quả phù hợp với việc trung vị loại ảnh hưởng của các outlier khi lân cận còn đủ tín hiệu hợp lệ. Tuy vậy vẫn phải xem chi tiết nhỏ có mất không, thay vì chỉ nhìn nền ảnh sạch hơn.”</w:t>
       </w:r>
     </w:p>
     <w:p>
@@ -10511,6 +10637,7 @@
           </w:tcPr>
           <w:p>
             <w:pPr>
+              <w:keepNext/>
               <w:spacing w:before="20" w:after="20" w:line="252" w:lineRule="auto"/>
             </w:pPr>
             <w:r>
@@ -10543,6 +10670,7 @@
           </w:tcPr>
           <w:p>
             <w:pPr>
+              <w:keepNext/>
               <w:spacing w:before="20" w:after="20" w:line="252" w:lineRule="auto"/>
             </w:pPr>
             <w:r>
@@ -10575,6 +10703,7 @@
           </w:tcPr>
           <w:p>
             <w:pPr>
+              <w:keepNext/>
               <w:spacing w:before="20" w:after="20" w:line="252" w:lineRule="auto"/>
               <w:jc w:val="center"/>
             </w:pPr>
@@ -10608,6 +10737,7 @@
           </w:tcPr>
           <w:p>
             <w:pPr>
+              <w:keepNext/>
               <w:spacing w:before="20" w:after="20" w:line="252" w:lineRule="auto"/>
               <w:jc w:val="center"/>
             </w:pPr>
@@ -10641,6 +10771,7 @@
           </w:tcPr>
           <w:p>
             <w:pPr>
+              <w:keepNext/>
               <w:spacing w:before="20" w:after="20" w:line="252" w:lineRule="auto"/>
               <w:jc w:val="center"/>
             </w:pPr>
@@ -10674,6 +10805,7 @@
           </w:tcPr>
           <w:p>
             <w:pPr>
+              <w:keepNext/>
               <w:spacing w:before="20" w:after="20" w:line="252" w:lineRule="auto"/>
               <w:jc w:val="center"/>
             </w:pPr>
@@ -11859,6 +11991,7 @@
               <w:rPr>
                 <w:sz w:val="20"/>
               </w:rPr>
+              <w:lastRenderedPageBreak/>
               <w:t>Mạnh</w:t>
             </w:r>
           </w:p>
@@ -12239,7 +12372,6 @@
               <w:rPr>
                 <w:sz w:val="20"/>
               </w:rPr>
-              <w:lastRenderedPageBreak/>
               <w:t>Mạnh</w:t>
             </w:r>
           </w:p>
@@ -12452,6 +12584,14 @@
       </w:r>
     </w:p>
     <w:p>
+      <w:r>
+        <w:rPr>
+          <w:i/>
+        </w:rPr>
+        <w:t>Người trình bày: Nguyễn Tùng Dương. Chuyển ý: “Khác với nhiễu xung, ảnh bị mờ đã mất một phần thông tin không gian.”</w:t>
+      </w:r>
+    </w:p>
+    <w:p>
       <w:pPr>
         <w:spacing w:before="60"/>
       </w:pPr>
@@ -12467,7 +12607,7 @@
       <w:pPr>
         <w:pStyle w:val="u1"/>
       </w:pPr>
-      <w:bookmarkStart w:id="18" w:name="_Toc243287452"/>
+      <w:bookmarkStart w:id="18" w:name="_Toc243605042"/>
       <w:r>
         <w:t>Slide 19 Làm sắc nét sau mờ Gaussian</w:t>
       </w:r>
@@ -12483,7 +12623,7 @@
     </w:p>
     <w:p>
       <w:r>
-        <w:t>“Khi mức mờ tăng, cả PSNR và SSIM của ảnh suy giảm đều giảm. Unsharp mask và SHARPEN cải thiện một phần, nhưng khoảng cải thiện ở mức mạnh tương đối nhỏ. Cụ thể, blur mạnh có PSNR 22,31 dB, sau unsharp là 22,86 dB; SSIM từ khoảng 0,815 lên 0,837. F1 tăng từ 0,7955 lên 0,8379. Điều này phù hợp với vai trò tăng chi tiết còn lại; nó không chứng minh đã lấy lại toàn bộ thông tin mất vì mờ.”</w:t>
+        <w:t>“Khi ảnh mờ mạnh, unsharp đưa PSNR từ 22,31 lên 22,86 dB và SSIM từ 0,8154 lên 0,8370. Khoảng cải thiện có thật nhưng tương đối nhỏ và chưa trở về ảnh sạch. Ở mức nhẹ SHARPEN có kết quả tốt hơn unsharp trong cấu hình đã thử; không suy rộng một phương pháp luôn tốt nhất. Bộ lọc chủ yếu tăng chi tiết còn lại, còn thông tin bị làm mờ không được khôi phục đầy đủ.”</w:t>
       </w:r>
     </w:p>
     <w:p>
@@ -12583,6 +12723,7 @@
           </w:tcPr>
           <w:p>
             <w:pPr>
+              <w:keepNext/>
               <w:spacing w:before="20" w:after="20" w:line="252" w:lineRule="auto"/>
             </w:pPr>
             <w:r>
@@ -12591,6 +12732,7 @@
                 <w:color w:val="FFFFFF"/>
                 <w:sz w:val="20"/>
               </w:rPr>
+              <w:lastRenderedPageBreak/>
               <w:t>Mức</w:t>
             </w:r>
           </w:p>
@@ -12615,6 +12757,7 @@
           </w:tcPr>
           <w:p>
             <w:pPr>
+              <w:keepNext/>
               <w:spacing w:before="20" w:after="20" w:line="252" w:lineRule="auto"/>
             </w:pPr>
             <w:r>
@@ -12647,6 +12790,7 @@
           </w:tcPr>
           <w:p>
             <w:pPr>
+              <w:keepNext/>
               <w:spacing w:before="20" w:after="20" w:line="252" w:lineRule="auto"/>
               <w:jc w:val="center"/>
             </w:pPr>
@@ -12680,6 +12824,7 @@
           </w:tcPr>
           <w:p>
             <w:pPr>
+              <w:keepNext/>
               <w:spacing w:before="20" w:after="20" w:line="252" w:lineRule="auto"/>
               <w:jc w:val="center"/>
             </w:pPr>
@@ -12713,6 +12858,7 @@
           </w:tcPr>
           <w:p>
             <w:pPr>
+              <w:keepNext/>
               <w:spacing w:before="20" w:after="20" w:line="252" w:lineRule="auto"/>
               <w:jc w:val="center"/>
             </w:pPr>
@@ -12746,6 +12892,7 @@
           </w:tcPr>
           <w:p>
             <w:pPr>
+              <w:keepNext/>
               <w:spacing w:before="20" w:after="20" w:line="252" w:lineRule="auto"/>
               <w:jc w:val="center"/>
             </w:pPr>
@@ -13551,7 +13698,6 @@
               <w:rPr>
                 <w:sz w:val="20"/>
               </w:rPr>
-              <w:lastRenderedPageBreak/>
               <w:t>Vừa</w:t>
             </w:r>
           </w:p>
@@ -14524,6 +14670,14 @@
       </w:r>
     </w:p>
     <w:p>
+      <w:r>
+        <w:rPr>
+          <w:i/>
+        </w:rPr>
+        <w:t>Người trình bày: Nguyễn Tùng Dương. Chuyển ý: “Với ám màu, tên gọi hiệu chỉnh cũng không bảo đảm kết quả tốt hơn.”</w:t>
+      </w:r>
+    </w:p>
+    <w:p>
       <w:pPr>
         <w:spacing w:before="60"/>
       </w:pPr>
@@ -14539,7 +14693,7 @@
       <w:pPr>
         <w:pStyle w:val="u1"/>
       </w:pPr>
-      <w:bookmarkStart w:id="19" w:name="_Toc243287453"/>
+      <w:bookmarkStart w:id="19" w:name="_Toc243605043"/>
       <w:r>
         <w:t>Slide 20 Ám màu và sai khác sau hiệu chỉnh</w:t>
       </w:r>
@@ -14555,7 +14709,7 @@
     </w:p>
     <w:p>
       <w:r>
-        <w:t>“Với ám màu, không thể mặc định thêm bước cân bằng màu là tốt. Ở mức nhẹ, ảnh suy giảm vốn đã gần ảnh sạch: PSNR 36,20 dB, SSIM gần 0,998 và ΔE khoảng 1,73. Sau RGB, HSV hoặc Lab, PSNR và SSIM đều giảm, còn ΔE tăng. Đặc biệt Lab cho ΔE khoảng 11,01 và F1 0,8844 so với degraded 0,9067. Điều này cho thấy giả định màu trung tính có thể không phù hợp cảnh hoa màu trội.”</w:t>
+        <w:t>“Ở ám màu nhẹ, cả ba cách hiệu chỉnh đều làm PSNR và SSIM giảm so ảnh suy giảm. Delta E từ 1,73 tăng lên 9,56 với RGB, 4,26 với HSV và 11,01 với Lab. Vì Delta E thấp hơn mới gần màu tham chiếu hơn, đây là phản ví dụ cho việc luôn thêm bước cân bằng màu. Cách hiệu chỉnh dựa trên thống kê toàn cảnh có thể thay đổi cả màu vốn đúng; để xác định từng nguyên nhân cần tách các bước trong một thí nghiệm riêng.”</w:t>
       </w:r>
     </w:p>
     <w:p>
@@ -14566,6 +14720,7 @@
         <w:rPr>
           <w:noProof/>
         </w:rPr>
+        <w:lastRenderedPageBreak/>
         <w:drawing>
           <wp:inline distT="0" distB="0" distL="0" distR="0" wp14:anchorId="2775F86C" wp14:editId="73C80A5E">
             <wp:extent cx="5976000" cy="2271930"/>
@@ -14611,7 +14766,7 @@
         <w:rPr>
           <w:b w:val="0"/>
         </w:rPr>
-        <w:t>Biểu đồ PSNR và SSIM trên slide 20</w:t>
+        <w:t>Biểu đồ PSNR/SSIM và các giá trị ΔE trên slide 20</w:t>
       </w:r>
     </w:p>
     <w:tbl>
@@ -14656,6 +14811,7 @@
           </w:tcPr>
           <w:p>
             <w:pPr>
+              <w:keepNext/>
               <w:spacing w:before="20" w:after="20" w:line="252" w:lineRule="auto"/>
             </w:pPr>
             <w:r>
@@ -14688,6 +14844,7 @@
           </w:tcPr>
           <w:p>
             <w:pPr>
+              <w:keepNext/>
               <w:spacing w:before="20" w:after="20" w:line="252" w:lineRule="auto"/>
             </w:pPr>
             <w:r>
@@ -14720,6 +14877,7 @@
           </w:tcPr>
           <w:p>
             <w:pPr>
+              <w:keepNext/>
               <w:spacing w:before="20" w:after="20" w:line="252" w:lineRule="auto"/>
               <w:jc w:val="center"/>
             </w:pPr>
@@ -14753,6 +14911,7 @@
           </w:tcPr>
           <w:p>
             <w:pPr>
+              <w:keepNext/>
               <w:spacing w:before="20" w:after="20" w:line="252" w:lineRule="auto"/>
               <w:jc w:val="center"/>
             </w:pPr>
@@ -14786,6 +14945,7 @@
           </w:tcPr>
           <w:p>
             <w:pPr>
+              <w:keepNext/>
               <w:spacing w:before="20" w:after="20" w:line="252" w:lineRule="auto"/>
               <w:jc w:val="center"/>
             </w:pPr>
@@ -14819,6 +14979,7 @@
           </w:tcPr>
           <w:p>
             <w:pPr>
+              <w:keepNext/>
               <w:spacing w:before="20" w:after="20" w:line="252" w:lineRule="auto"/>
               <w:jc w:val="center"/>
             </w:pPr>
@@ -14852,6 +15013,7 @@
           </w:tcPr>
           <w:p>
             <w:pPr>
+              <w:keepNext/>
               <w:spacing w:before="20" w:after="20" w:line="252" w:lineRule="auto"/>
               <w:jc w:val="center"/>
             </w:pPr>
@@ -14897,7 +15059,6 @@
               <w:rPr>
                 <w:sz w:val="20"/>
               </w:rPr>
-              <w:lastRenderedPageBreak/>
               <w:t>Nhẹ</w:t>
             </w:r>
           </w:p>
@@ -17575,6 +17736,15 @@
       </w:r>
     </w:p>
     <w:p>
+      <w:r>
+        <w:rPr>
+          <w:i/>
+        </w:rPr>
+        <w:lastRenderedPageBreak/>
+        <w:t>Người trình bày: Nguyễn Tùng Dương. Chuyển ý: “Các kết quả vừa rồi nói về chất lượng ảnh; tiếp theo là tác động đến nhận diện.”</w:t>
+      </w:r>
+    </w:p>
+    <w:p>
       <w:pPr>
         <w:spacing w:before="60"/>
       </w:pPr>
@@ -17589,11 +17759,9 @@
     <w:p>
       <w:pPr>
         <w:pStyle w:val="u1"/>
-        <w:pageBreakBefore/>
       </w:pPr>
-      <w:bookmarkStart w:id="20" w:name="_Toc243287454"/>
-      <w:r>
-        <w:lastRenderedPageBreak/>
+      <w:bookmarkStart w:id="20" w:name="_Toc243605044"/>
+      <w:r>
         <w:t>Slide 21 Tác động xử lý ảnh đến nhận diện</w:t>
       </w:r>
       <w:bookmarkEnd w:id="20"/>
@@ -17608,7 +17776,7 @@
     </w:p>
     <w:p>
       <w:r>
-        <w:t>“Biểu đồ này chọn ba ví dụ để đối chiếu Macro F1 trước và sau xử lý. Với nhiễu xung mạnh, median tăng F1 từ khoảng 0,686 lên 0,887. Với Gaussian noise mạnh, Gaussian filter tăng từ 0,579 lên 0,696. Ngược lại, Gamma ở thiếu sáng nhẹ giảm từ khoảng 0,913 xuống 0,900 dù ảnh gần sạch hơn. Clean Macro F1 là 0,9020 và được dùng làm mốc tham chiếu riêng. Như vậy không có quy tắc rằng xử lý luôn có lợi cho nhận diện.”</w:t>
+        <w:t>“Cùng MobileNetV2 cho Macro F1 ảnh sạch là 0,9020. Ba cặp trên slide chỉ là ví dụ trong 33 cặp: median ở nhiễu xung mạnh tăng F1 từ 0,6863 lên 0,8869; Gaussian ở nhiễu Gaussian mạnh tăng từ 0,5787 lên 0,6959; Gamma ở thiếu sáng nhẹ lại giảm từ 0,9127 xuống 0,9002. Mức tăng median là khoảng 20,07 điểm phần trăm trên thang 0 đến 100. Những ví dụ này cho thấy cả lợi ích lẫn trường hợp gây hại.”</w:t>
       </w:r>
     </w:p>
     <w:p>
@@ -17669,6 +17837,14 @@
       </w:r>
     </w:p>
     <w:p>
+      <w:r>
+        <w:rPr>
+          <w:i/>
+        </w:rPr>
+        <w:t>Người trình bày: Nguyễn Tùng Dương. Chuyển ý: “Vì sao một phép xử lý làm ảnh gần tham chiếu hơn mà F1 vẫn giảm? Ta xem đồng thời cả hai chỉ số.”</w:t>
+      </w:r>
+    </w:p>
+    <w:p>
       <w:pPr>
         <w:spacing w:before="60"/>
       </w:pPr>
@@ -17684,7 +17860,7 @@
       <w:pPr>
         <w:pStyle w:val="u1"/>
       </w:pPr>
-      <w:bookmarkStart w:id="21" w:name="_Toc243287455"/>
+      <w:bookmarkStart w:id="21" w:name="_Toc243605045"/>
       <w:r>
         <w:t>Slide 22 SSIM tăng không bảo đảm nhận diện tăng</w:t>
       </w:r>
@@ -17700,7 +17876,7 @@
     </w:p>
     <w:p>
       <w:r>
-        <w:t>“Mỗi điểm trên biểu đồ là một cặp enhanced so với degraded tương ứng. Trục ngang là chênh lệch SSIM, trục dọc là chênh lệch Macro F1. Góc trên bên phải nghĩa là cả hai tăng; góc dưới bên phải nghĩa là SSIM tăng nhưng F1 giảm. Trên 33 cặp, Pearson khoảng 0,710 và Spearman khoảng 0,702 cho thấy xu hướng đồng biến ở mức điều kiện. Tuy nhiên vẫn có phản ví dụ như Gamma nhẹ. Các điểm dùng chung ảnh và model, nên nhóm không dùng tương quan này để khẳng định quan hệ nhân quả.”</w:t>
+        <w:t>“Mỗi điểm là một trong 33 cặp sau xử lý so với suy giảm. Trục ngang đo thay đổi SSIM, trục đứng đo thay đổi Macro F1. Pearson 0,710 và Spearman 0,702 mô tả xu hướng cùng biến thiên, không bảo đảm từng điểm cùng tăng. Gamma ở thiếu sáng nhẹ nằm phía SSIM tăng nhưng F1 giảm từ 0,9127 xuống 0,9002. Các điều kiện dùng chung ảnh và model nên không độc lập; không suy ra nhân quả hoặc dự đoán một ảnh mới từ hệ số tương quan.”</w:t>
       </w:r>
     </w:p>
     <w:p>
@@ -17799,6 +17975,14 @@
       </w:r>
     </w:p>
     <w:p>
+      <w:r>
+        <w:rPr>
+          <w:i/>
+        </w:rPr>
+        <w:t>Người trình bày: Nguyễn Tùng Dương. Chuyển ý: “Em xin chuyển cho bạn Thành phân tích hai ca ảnh cụ thể và minh họa ứng dụng.”</w:t>
+      </w:r>
+    </w:p>
+    <w:p>
       <w:pPr>
         <w:spacing w:before="60"/>
       </w:pPr>
@@ -17814,7 +17998,7 @@
       <w:pPr>
         <w:pStyle w:val="u1"/>
       </w:pPr>
-      <w:bookmarkStart w:id="22" w:name="_Toc243287456"/>
+      <w:bookmarkStart w:id="22" w:name="_Toc243605046"/>
       <w:r>
         <w:t>Slide 23 Median giúp sửa một ca nhiễu xung</w:t>
       </w:r>
@@ -17830,7 +18014,7 @@
     </w:p>
     <w:p>
       <w:r>
-        <w:t>“Đây là ca B có nhãn thật daisy. Ảnh sạch được dự đoán daisy với điểm softmax khoảng 99,72%. Sau nhiễu xung mạnh, nhãn chuyển thành dandelion với khoảng 92,25%. Sau median, nhãn trở lại daisy với khoảng 98,68%. Ca này minh họa rằng loại bỏ outlier có thể giúp khôi phục dấu hiệu mà model sử dụng. Tuy nhiên đây là ví dụ được chọn để phân tích, không đại diện cho tỷ lệ thành công của toàn bộ 550 ảnh; tỷ lệ và F1 phải đọc ở bảng tổng.”</w:t>
+        <w:t>“Đây là một ảnh daisy trong kết quả đã lưu. Ảnh sạch được dự đoán đúng; sau nhiễu xung mạnh model nhầm dandelion; sau median nhãn trở về daisy. Ta quan sát được việc loại các chấm nhiễu đi cùng dự đoán đúng trong ca này. Một ví dụ không thay thế kết quả tổng hợp 550 ảnh và chưa chứng minh model thực sự dựa vào cấu trúc cánh hoa.”</w:t>
       </w:r>
     </w:p>
     <w:p>
@@ -17929,6 +18113,14 @@
       </w:r>
     </w:p>
     <w:p>
+      <w:r>
+        <w:rPr>
+          <w:i/>
+        </w:rPr>
+        <w:t>Người trình bày: Trương Việt Thành. Chuyển ý: “Ca tiếp theo cho thấy xử lý cũng có thể biến một dự đoán đúng thành sai.”</w:t>
+      </w:r>
+    </w:p>
+    <w:p>
       <w:pPr>
         <w:spacing w:before="60"/>
       </w:pPr>
@@ -17944,7 +18136,7 @@
       <w:pPr>
         <w:pStyle w:val="u1"/>
       </w:pPr>
-      <w:bookmarkStart w:id="23" w:name="_Toc243287457"/>
+      <w:bookmarkStart w:id="23" w:name="_Toc243605047"/>
       <w:r>
         <w:t>Slide 24 Hiệu chỉnh màu có thể làm nhận diện sai</w:t>
       </w:r>
@@ -17960,7 +18152,7 @@
     </w:p>
     <w:p>
       <w:r>
-        <w:t>“Ca D cũng có nhãn thật daisy. Ảnh sạch được dự đoán daisy với khoảng 52,76%; ảnh ám màu nhẹ vẫn là daisy với khoảng 51,21%. Sau HSV correction, dự đoán thành dandelion với khoảng 57,29%. Mặc dù điểm của nhãn đứng đầu tăng, kết quả lại từ đúng thành sai. Ca này minh họa rủi ro khi sửa màu bằng một quy tắc chung trên cảnh có màu đặc trưng, đồng thời cho thấy điểm softmax cao hơn không đồng nghĩa tốt hơn.”</w:t>
+        <w:t>“Ảnh có nhãn daisy và bị ám màu nhẹ vẫn được dự đoán đúng. Sau HSV correction, dự đoán đổi thành dandelion. Ca này minh họa lý do cần giữ nhánh ảnh suy giảm chưa xử lý làm đối chứng. Confidence tăng của nhãn sai không có nghĩa chất lượng hoặc độ đúng tốt hơn. Hoa nhỏ và nền xanh là quan sát thị giác; bài chưa có thí nghiệm can thiệp để khẳng định nền gây ra lỗi.”</w:t>
       </w:r>
     </w:p>
     <w:p>
@@ -18059,6 +18251,14 @@
       </w:r>
     </w:p>
     <w:p>
+      <w:r>
+        <w:rPr>
+          <w:i/>
+        </w:rPr>
+        <w:t>Người trình bày: Trương Việt Thành. Chuyển ý: “Các bước xử lý và suy luận này được đưa vào một ứng dụng để thử tương tác.”</w:t>
+      </w:r>
+    </w:p>
+    <w:p>
       <w:pPr>
         <w:spacing w:before="60"/>
       </w:pPr>
@@ -18075,7 +18275,7 @@
         <w:pStyle w:val="u1"/>
         <w:pageBreakBefore/>
       </w:pPr>
-      <w:bookmarkStart w:id="24" w:name="_Toc243287458"/>
+      <w:bookmarkStart w:id="24" w:name="_Toc243605048"/>
       <w:r>
         <w:lastRenderedPageBreak/>
         <w:t>Slide 25 Ứng dụng minh họa pipeline xử lý ảnh</w:t>
@@ -18092,7 +18292,7 @@
     </w:p>
     <w:p>
       <w:r>
-        <w:t>“Ứng dụng Streamlit cho phép tải ảnh, chọn dạng và mức suy giảm, chọn cách xử lý rồi so ba trạng thái cùng dự đoán. Giao diện gọi trực tiếp pipeline Python, dùng cùng các hàm thuật toán và tham số khóa; đây là kiến trúc standalone. Ba trạng thái được gom vào một lần gọi dự đoán theo batch. URL đã được chủ dự án xác nhận, và bản ghi kiểm tra ngày 05/10/2026 cho thấy trang trả HTTP 200. Bằng chứng đó chưa đủ xác nhận checkpoint cloud, commit đang chạy hoặc toàn bộ luồng dự đoán trên cloud.”</w:t>
+        <w:t>“Trong ứng dụng, người dùng tải JPEG hoặc PNG, chọn loại và mức suy giảm rồi chọn phương pháp. Giao diện so ảnh đầu vào, ảnh suy giảm, ảnh sau xử lý cùng nhãn và xác suất. Streamlit gọi trực tiếp cùng pipeline Python và các tham số đã khóa. Dải ảnh trên slide là ví dụ lưu từ thực nghiệm, không phải ảnh chụp một phiên cloud vừa chạy. Khi demo trực tiếp, nhóm sẽ chỉ rõ nhãn và hình thay đổi; ảnh đầu vào của người dùng không mặc nhiên là ảnh sạch có nhãn tham chiếu.”</w:t>
       </w:r>
     </w:p>
     <w:p>
@@ -18105,21 +18305,12 @@
     </w:p>
     <w:p>
       <w:r>
-        <w:t xml:space="preserve">Chuẩn bị một ảnh dễ quan sát, chọn muối tiêu mạnh và median; chỉ ra ba ảnh, nhãn và tham số. Nói rõ đây là minh họa một ảnh, không phải đánh giá lại toàn bộ Test. Nếu ảnh tải lên vốn đã nhiễu, “clean” trong giao diện chỉ là ảnh đầu vào gốc của phiên demo, </w:t>
-      </w:r>
-      <w:r>
-        <w:rPr>
-          <w:b/>
-        </w:rPr>
-        <w:t>không bảo đảm là ảnh sạch có ground truth</w:t>
-      </w:r>
-      <w:r>
-        <w:t xml:space="preserve"> như tham chiếu trong thực nghiệm.</w:t>
+        <w:t>Demo trực tiếp theo một luồng: tải một JPEG/PNG, chọn muối tiêu mạnh, chọn median, rồi chỉ vào ba trạng thái ảnh và nhãn tương ứng. Dải ảnh trong slide là ví dụ chạy lại một ảnh bằng source và cấu hình khóa, không phải ảnh chụp giao diện cloud. Nếu ảnh tải lên vốn đã nhiễu, “ảnh gốc” chỉ có nghĩa đầu vào của phiên demo, không bảo đảm là ảnh sạch có ground truth.</w:t>
       </w:r>
     </w:p>
     <w:p>
       <w:r>
-        <w:t>Không nói ứng dụng tự nhận biết mức nhiễu: người dùng đang chọn loại/mức. Nếu không demo được vì kết nối, dùng ảnh và kết quả đã lưu, đồng thời nói rõ chúng là dữ liệu ghi lại. Không trình bày screenshot hoặc nhãn suy luận giả như một phiên chạy mới.</w:t>
+        <w:t>Nếu không chạy được giao diện trong buổi trình bày, nói rõ đang dùng hình và kết quả đã lưu. Người dùng hiện chọn loại và mức suy giảm; hệ thống chưa tự phát hiện hai thông tin đó. Không gọi ảnh minh họa là bằng chứng kiểm thử cloud. Bản ghi HTTP ngày 05/10/2026 chỉ xác nhận truy cập trang, chưa xác nhận commit, checkpoint hoặc suy luận đầy đủ trên cloud.</w:t>
       </w:r>
     </w:p>
     <w:p>
@@ -18131,6 +18322,14 @@
       </w:r>
       <w:r>
         <w:t xml:space="preserve"> readiness kiểm tra checkpoint, metadata, class order và locked params; dùng chung source giúp giảm lệch giữa demo và thực nghiệm. Điều này không tự chứng minh cloud đang chạy đúng phiên bản.</w:t>
+      </w:r>
+    </w:p>
+    <w:p>
+      <w:r>
+        <w:rPr>
+          <w:i/>
+        </w:rPr>
+        <w:t>Người trình bày: Trương Việt Thành. Chuyển ý: “Từ nguyên lý, kết quả tổng hợp và các ca minh họa, nhóm rút ra các kết luận sau.”</w:t>
       </w:r>
     </w:p>
     <w:p>
@@ -18149,7 +18348,7 @@
       <w:pPr>
         <w:pStyle w:val="u1"/>
       </w:pPr>
-      <w:bookmarkStart w:id="25" w:name="_Toc243287459"/>
+      <w:bookmarkStart w:id="25" w:name="_Toc243605049"/>
       <w:r>
         <w:t>Slide 26 Kết luận về tăng cường và phục hồi ảnh</w:t>
       </w:r>
@@ -18165,7 +18364,7 @@
     </w:p>
     <w:p>
       <w:r>
-        <w:t>“Kết quả chính của nhóm là hiệu quả xử lý phụ thuộc cơ chế suy giảm và cấu hình cụ thể. Median phù hợp rõ với nhiễu xung trong tập thử; Gaussian và bilateral thể hiện đánh đổi thay đổi theo mức nhiễu; làm sắc nét chỉ phục hồi được một phần sau mờ. Các phép hiệu chỉnh màu dựa trên giả định trung tính có thể gây hại trên cảnh hoa màu trội. Vì vậy nhóm đánh giá chất lượng ảnh và nhận diện như hai kết quả riêng, có đối chứng không xử lý và có giới hạn phạm vi kết luận.”</w:t>
+        <w:t>“Hiệu quả xử lý phụ thuộc cơ chế suy giảm, mức và tham số. Median cải thiện rõ nhiễu xung mạnh, còn Gaussian và bilateral đổi thứ tự theo mức nhiễu. Làm sắc nét chỉ khôi phục một phần sau mờ; hiệu chỉnh màu có thể gây hại khi giả định trung tính không phù hợp cảnh. Kết quả Gamma cho thấy chất lượng ảnh và nhận diện cần được đo riêng. Các nhận xét đều thuộc dữ liệu và cấu hình đã khảo sát.”</w:t>
       </w:r>
     </w:p>
     <w:p>
@@ -18198,6 +18397,14 @@
       </w:r>
     </w:p>
     <w:p>
+      <w:r>
+        <w:rPr>
+          <w:i/>
+        </w:rPr>
+        <w:t>Người trình bày: Trương Việt Thành. Chuyển ý: “Cuối cùng là những giới hạn cần nhớ và các hướng kiểm tra tiếp theo.”</w:t>
+      </w:r>
+    </w:p>
+    <w:p>
       <w:pPr>
         <w:spacing w:before="60"/>
       </w:pPr>
@@ -18213,7 +18420,7 @@
       <w:pPr>
         <w:pStyle w:val="u1"/>
       </w:pPr>
-      <w:bookmarkStart w:id="26" w:name="_Toc243287460"/>
+      <w:bookmarkStart w:id="26" w:name="_Toc243605050"/>
       <w:r>
         <w:lastRenderedPageBreak/>
         <w:t>Slide 27 Hạn chế và hướng phát triển</w:t>
@@ -18230,7 +18437,7 @@
     </w:p>
     <w:p>
       <w:r>
-        <w:t>“Bài hiện mới có một split, một checkpoint, năm lớp hoa và suy giảm tổng hợp biết trước loại/mức. Metric ảnh dùng stride 4; một nhóm trùng chéo nhãn cần được xác minh. Tham số ưu tiên Macro F1 trên Validation, nên đây chưa phải bài tối ưu riêng chất lượng ảnh. Hướng tiếp theo là ảnh suy giảm thực, nhiều seed hoặc split, kiểm tra độ đúng của metric, và đối chứng các tiêu chí chọn tham số khác nhau. Nhóm cũng cần kiểm thử đầy đủ bản cloud. Em xin kết thúc và sẵn sàng trao đổi về cơ chế thuật toán cũng như cách đọc kết quả.”</w:t>
+        <w:t>“Thí nghiệm mới dùng một split, một checkpoint và năm lớp hoa với suy giảm tổng hợp biết trước loại và mức. Metric ảnh dùng stride bốn, dữ liệu có một nhóm trùng chéo nhãn cần xác minh, và tuning ưu tiên F1. Hướng tiếp theo là ảnh suy giảm thực, thêm seed hoặc split, kiểm tra metric và đối chiếu các tiêu chí chọn tham số. Phiên cloud cần kiểm thử và đối chiếu checkpoint riêng. Nhóm em xin kết thúc và sẵn sàng trao đổi.”</w:t>
       </w:r>
     </w:p>
     <w:p>
@@ -18255,6 +18462,14 @@
       </w:r>
       <w:r>
         <w:t xml:space="preserve"> “Có, trong phạm vi đã kiểm soát và được công bố. Điều cần tránh là biến một kết quả có điều kiện thành khẳng định phổ quát. Bộ dự đoán, tham số và manifest cho phép kiểm tra lại kết luận.”</w:t>
+      </w:r>
+    </w:p>
+    <w:p>
+      <w:r>
+        <w:rPr>
+          <w:i/>
+        </w:rPr>
+        <w:t>Người trình bày: Trương Việt Thành. Chuyển ý: “Khi trả lời câu hỏi, luôn nêu loại suy giảm, mức, phương pháp, mốc đối chứng và giới hạn của bằng chứng.”</w:t>
       </w:r>
     </w:p>
     <w:p>
@@ -18274,7 +18489,7 @@
         <w:pStyle w:val="u1"/>
         <w:pageBreakBefore/>
       </w:pPr>
-      <w:bookmarkStart w:id="27" w:name="_Toc243287461"/>
+      <w:bookmarkStart w:id="27" w:name="_Toc243605051"/>
       <w:r>
         <w:lastRenderedPageBreak/>
         <w:t>Đọc sâu các bảng kết quả trong báo cáo</w:t>
@@ -18351,6 +18566,7 @@
           </w:tcPr>
           <w:p>
             <w:pPr>
+              <w:keepNext/>
               <w:spacing w:before="20" w:after="20" w:line="252" w:lineRule="auto"/>
             </w:pPr>
             <w:r>
@@ -18383,6 +18599,7 @@
           </w:tcPr>
           <w:p>
             <w:pPr>
+              <w:keepNext/>
               <w:spacing w:before="20" w:after="20" w:line="252" w:lineRule="auto"/>
             </w:pPr>
             <w:r>
@@ -18415,6 +18632,7 @@
           </w:tcPr>
           <w:p>
             <w:pPr>
+              <w:keepNext/>
               <w:spacing w:before="20" w:after="20" w:line="252" w:lineRule="auto"/>
               <w:jc w:val="center"/>
             </w:pPr>
@@ -18448,6 +18666,7 @@
           </w:tcPr>
           <w:p>
             <w:pPr>
+              <w:keepNext/>
               <w:spacing w:before="20" w:after="20" w:line="252" w:lineRule="auto"/>
               <w:jc w:val="center"/>
             </w:pPr>
@@ -19323,6 +19542,7 @@
           </w:tcPr>
           <w:p>
             <w:pPr>
+              <w:keepNext/>
               <w:spacing w:before="20" w:after="20" w:line="252" w:lineRule="auto"/>
             </w:pPr>
             <w:r>
@@ -19355,6 +19575,7 @@
           </w:tcPr>
           <w:p>
             <w:pPr>
+              <w:keepNext/>
               <w:spacing w:before="20" w:after="20" w:line="252" w:lineRule="auto"/>
             </w:pPr>
             <w:r>
@@ -19387,6 +19608,7 @@
           </w:tcPr>
           <w:p>
             <w:pPr>
+              <w:keepNext/>
               <w:spacing w:before="20" w:after="20" w:line="252" w:lineRule="auto"/>
               <w:jc w:val="center"/>
             </w:pPr>
@@ -19420,6 +19642,7 @@
           </w:tcPr>
           <w:p>
             <w:pPr>
+              <w:keepNext/>
               <w:spacing w:before="20" w:after="20" w:line="252" w:lineRule="auto"/>
               <w:jc w:val="center"/>
             </w:pPr>
@@ -19453,6 +19676,7 @@
           </w:tcPr>
           <w:p>
             <w:pPr>
+              <w:keepNext/>
               <w:spacing w:before="20" w:after="20" w:line="252" w:lineRule="auto"/>
               <w:jc w:val="center"/>
             </w:pPr>
@@ -19681,6 +19905,7 @@
           </w:tcPr>
           <w:p>
             <w:pPr>
+              <w:keepNext/>
               <w:spacing w:before="20" w:after="20" w:line="252" w:lineRule="auto"/>
             </w:pPr>
             <w:r>
@@ -19713,6 +19938,7 @@
           </w:tcPr>
           <w:p>
             <w:pPr>
+              <w:keepNext/>
               <w:spacing w:before="20" w:after="20" w:line="252" w:lineRule="auto"/>
             </w:pPr>
             <w:r>
@@ -19745,6 +19971,7 @@
           </w:tcPr>
           <w:p>
             <w:pPr>
+              <w:keepNext/>
               <w:spacing w:before="20" w:after="20" w:line="252" w:lineRule="auto"/>
               <w:jc w:val="center"/>
             </w:pPr>
@@ -19778,6 +20005,7 @@
           </w:tcPr>
           <w:p>
             <w:pPr>
+              <w:keepNext/>
               <w:spacing w:before="20" w:after="20" w:line="252" w:lineRule="auto"/>
               <w:jc w:val="center"/>
             </w:pPr>
@@ -19811,6 +20039,7 @@
           </w:tcPr>
           <w:p>
             <w:pPr>
+              <w:keepNext/>
               <w:spacing w:before="20" w:after="20" w:line="252" w:lineRule="auto"/>
               <w:jc w:val="center"/>
             </w:pPr>
@@ -20712,6 +20941,7 @@
           </w:tcPr>
           <w:p>
             <w:pPr>
+              <w:keepNext/>
               <w:spacing w:before="20" w:after="20" w:line="252" w:lineRule="auto"/>
             </w:pPr>
             <w:r>
@@ -20744,6 +20974,7 @@
           </w:tcPr>
           <w:p>
             <w:pPr>
+              <w:keepNext/>
               <w:spacing w:before="20" w:after="20" w:line="252" w:lineRule="auto"/>
             </w:pPr>
             <w:r>
@@ -20776,6 +21007,7 @@
           </w:tcPr>
           <w:p>
             <w:pPr>
+              <w:keepNext/>
               <w:spacing w:before="20" w:after="20" w:line="252" w:lineRule="auto"/>
               <w:jc w:val="center"/>
             </w:pPr>
@@ -20809,6 +21041,7 @@
           </w:tcPr>
           <w:p>
             <w:pPr>
+              <w:keepNext/>
               <w:spacing w:before="20" w:after="20" w:line="252" w:lineRule="auto"/>
               <w:jc w:val="center"/>
             </w:pPr>
@@ -20842,6 +21075,7 @@
           </w:tcPr>
           <w:p>
             <w:pPr>
+              <w:keepNext/>
               <w:spacing w:before="20" w:after="20" w:line="252" w:lineRule="auto"/>
               <w:jc w:val="center"/>
             </w:pPr>
@@ -20875,6 +21109,7 @@
           </w:tcPr>
           <w:p>
             <w:pPr>
+              <w:keepNext/>
               <w:spacing w:before="20" w:after="20" w:line="252" w:lineRule="auto"/>
               <w:jc w:val="center"/>
             </w:pPr>
@@ -22050,6 +22285,7 @@
           </w:tcPr>
           <w:p>
             <w:pPr>
+              <w:keepNext/>
               <w:spacing w:before="20" w:after="20" w:line="252" w:lineRule="auto"/>
             </w:pPr>
             <w:r>
@@ -22082,6 +22318,7 @@
           </w:tcPr>
           <w:p>
             <w:pPr>
+              <w:keepNext/>
               <w:spacing w:before="20" w:after="20" w:line="252" w:lineRule="auto"/>
             </w:pPr>
             <w:r>
@@ -22114,6 +22351,7 @@
           </w:tcPr>
           <w:p>
             <w:pPr>
+              <w:keepNext/>
               <w:spacing w:before="20" w:after="20" w:line="252" w:lineRule="auto"/>
               <w:jc w:val="center"/>
             </w:pPr>
@@ -22147,6 +22385,7 @@
           </w:tcPr>
           <w:p>
             <w:pPr>
+              <w:keepNext/>
               <w:spacing w:before="20" w:after="20" w:line="252" w:lineRule="auto"/>
               <w:jc w:val="center"/>
             </w:pPr>
@@ -22180,6 +22419,7 @@
           </w:tcPr>
           <w:p>
             <w:pPr>
+              <w:keepNext/>
               <w:spacing w:before="20" w:after="20" w:line="252" w:lineRule="auto"/>
               <w:jc w:val="center"/>
             </w:pPr>
@@ -24674,6 +24914,7 @@
           </w:tcPr>
           <w:p>
             <w:pPr>
+              <w:keepNext/>
               <w:spacing w:before="20" w:after="20" w:line="252" w:lineRule="auto"/>
             </w:pPr>
             <w:r>
@@ -24706,6 +24947,7 @@
           </w:tcPr>
           <w:p>
             <w:pPr>
+              <w:keepNext/>
               <w:spacing w:before="20" w:after="20" w:line="252" w:lineRule="auto"/>
             </w:pPr>
             <w:r>
@@ -24738,6 +24980,7 @@
           </w:tcPr>
           <w:p>
             <w:pPr>
+              <w:keepNext/>
               <w:spacing w:before="20" w:after="20" w:line="252" w:lineRule="auto"/>
               <w:jc w:val="center"/>
             </w:pPr>
@@ -24771,6 +25014,7 @@
           </w:tcPr>
           <w:p>
             <w:pPr>
+              <w:keepNext/>
               <w:spacing w:before="20" w:after="20" w:line="252" w:lineRule="auto"/>
               <w:jc w:val="center"/>
             </w:pPr>
@@ -29106,6 +29350,7 @@
           </w:tcPr>
           <w:p>
             <w:pPr>
+              <w:keepNext/>
               <w:spacing w:before="20" w:after="20" w:line="252" w:lineRule="auto"/>
             </w:pPr>
             <w:r>
@@ -29138,6 +29383,7 @@
           </w:tcPr>
           <w:p>
             <w:pPr>
+              <w:keepNext/>
               <w:spacing w:before="20" w:after="20" w:line="252" w:lineRule="auto"/>
             </w:pPr>
             <w:r>
@@ -29170,6 +29416,7 @@
           </w:tcPr>
           <w:p>
             <w:pPr>
+              <w:keepNext/>
               <w:spacing w:before="20" w:after="20" w:line="252" w:lineRule="auto"/>
               <w:jc w:val="center"/>
             </w:pPr>
@@ -29203,6 +29450,7 @@
           </w:tcPr>
           <w:p>
             <w:pPr>
+              <w:keepNext/>
               <w:spacing w:before="20" w:after="20" w:line="252" w:lineRule="auto"/>
               <w:jc w:val="center"/>
             </w:pPr>
@@ -30143,6 +30391,7 @@
           </w:tcPr>
           <w:p>
             <w:pPr>
+              <w:keepNext/>
               <w:spacing w:before="20" w:after="20" w:line="252" w:lineRule="auto"/>
             </w:pPr>
             <w:r>
@@ -30175,6 +30424,7 @@
           </w:tcPr>
           <w:p>
             <w:pPr>
+              <w:keepNext/>
               <w:spacing w:before="20" w:after="20" w:line="252" w:lineRule="auto"/>
             </w:pPr>
             <w:r>
@@ -30207,6 +30457,7 @@
           </w:tcPr>
           <w:p>
             <w:pPr>
+              <w:keepNext/>
               <w:spacing w:before="20" w:after="20" w:line="252" w:lineRule="auto"/>
               <w:jc w:val="center"/>
             </w:pPr>
@@ -30240,6 +30491,7 @@
           </w:tcPr>
           <w:p>
             <w:pPr>
+              <w:keepNext/>
               <w:spacing w:before="20" w:after="20" w:line="252" w:lineRule="auto"/>
               <w:jc w:val="center"/>
             </w:pPr>
@@ -30273,6 +30525,7 @@
           </w:tcPr>
           <w:p>
             <w:pPr>
+              <w:keepNext/>
               <w:spacing w:before="20" w:after="20" w:line="252" w:lineRule="auto"/>
               <w:jc w:val="center"/>
             </w:pPr>
@@ -30306,6 +30559,7 @@
           </w:tcPr>
           <w:p>
             <w:pPr>
+              <w:keepNext/>
               <w:spacing w:before="20" w:after="20" w:line="252" w:lineRule="auto"/>
               <w:jc w:val="center"/>
             </w:pPr>
@@ -30562,6 +30816,7 @@
           </w:tcPr>
           <w:p>
             <w:pPr>
+              <w:keepNext/>
               <w:spacing w:before="20" w:after="20" w:line="252" w:lineRule="auto"/>
             </w:pPr>
             <w:r>
@@ -30594,6 +30849,7 @@
           </w:tcPr>
           <w:p>
             <w:pPr>
+              <w:keepNext/>
               <w:spacing w:before="20" w:after="20" w:line="252" w:lineRule="auto"/>
             </w:pPr>
             <w:r>
@@ -30626,6 +30882,7 @@
           </w:tcPr>
           <w:p>
             <w:pPr>
+              <w:keepNext/>
               <w:spacing w:before="20" w:after="20" w:line="252" w:lineRule="auto"/>
               <w:jc w:val="center"/>
             </w:pPr>
@@ -33934,7 +34191,7 @@
         <w:pStyle w:val="u1"/>
         <w:pageBreakBefore/>
       </w:pPr>
-      <w:bookmarkStart w:id="28" w:name="_Toc243287462"/>
+      <w:bookmarkStart w:id="28" w:name="_Toc243605052"/>
       <w:r>
         <w:lastRenderedPageBreak/>
         <w:t>Bộ câu hỏi bảo vệ và cách trả lời</w:t>
@@ -34138,7 +34395,7 @@
         <w:pStyle w:val="u1"/>
         <w:pageBreakBefore/>
       </w:pPr>
-      <w:bookmarkStart w:id="29" w:name="_Toc243287463"/>
+      <w:bookmarkStart w:id="29" w:name="_Toc243605053"/>
       <w:r>
         <w:lastRenderedPageBreak/>
         <w:t>Phiếu tổng ôn trước khi trình bày</w:t>
@@ -34237,7 +34494,7 @@
         <w:pStyle w:val="u1"/>
         <w:pageBreakBefore/>
       </w:pPr>
-      <w:bookmarkStart w:id="30" w:name="_Toc243287464"/>
+      <w:bookmarkStart w:id="30" w:name="_Toc243605054"/>
       <w:r>
         <w:lastRenderedPageBreak/>
         <w:t>Nguồn và phạm vi kiểm tra</w:t>

</xml_diff>